<commit_message>
Apply submission audit fixes to Word document
Apply the editorial audit (#1-#50) to the .docx generator and regenerate
the Word file. No empirical numbers, results, citations, or figure images
were changed.

- Add bracketed author/affiliation/email placeholders under the title
- Remove self-demoting framing and dev-tooling/repository-path language
- Renumber figures and tables sequentially by first appearance
  (main figures 1-4, tables 1-3; appendix figures A1-A6, tables A1-A6)
- Keep figures and tables attached to their captions across page breaks;
  repeat table headers on continued pages and prevent row splits
- Standardize R-squared to R²
- Use readable feature-set names in prose; clarify MAPE near-zero handling
- Clarify the 56.224 train-only vs 55.325 refit MAE distinction
- Clean reference formatting and dataset access-year wording

https://claude.ai/code/session_01TvC5bYfe44i7oUiT2E8utv
</commit_message>
<xml_diff>
--- a/public-signal-service-forecasting/paper/output/public_signal_service_forecasting_final_submission.docx
+++ b/public-signal-service-forecasting/paper/output/public_signal_service_forecasting_final_submission.docx
@@ -24,14 +24,57 @@
         <w:rPr>
           <w:rFonts w:ascii="Times New Roman" w:hAnsi="Times New Roman"/>
           <w:b w:val="0"/>
-          <w:i/>
-          <w:sz w:val="20"/>
+          <w:i w:val="0"/>
+          <w:sz w:val="24"/>
         </w:rPr>
-        <w:t>arXiv-style / workshop-style research artifact. The study is predictive and correlational; it makes no causal, production-readiness, real-dispatch, or full-paper-readiness claim. All empirical values are read from committed repository artifacts under reports/ and data/metadata/.</w:t>
+        <w:t>[Author Name]</w:t>
       </w:r>
     </w:p>
     <w:p>
       <w:pPr>
+        <w:jc w:val="center"/>
+      </w:pPr>
+      <w:r>
+        <w:rPr>
+          <w:rFonts w:ascii="Times New Roman" w:hAnsi="Times New Roman"/>
+          <w:b w:val="0"/>
+          <w:i/>
+          <w:sz w:val="22"/>
+        </w:rPr>
+        <w:t>[Affiliation]</w:t>
+      </w:r>
+    </w:p>
+    <w:p>
+      <w:pPr>
+        <w:jc w:val="center"/>
+      </w:pPr>
+      <w:r>
+        <w:rPr>
+          <w:rFonts w:ascii="Times New Roman" w:hAnsi="Times New Roman"/>
+          <w:b w:val="0"/>
+          <w:i w:val="0"/>
+          <w:sz w:val="22"/>
+        </w:rPr>
+        <w:t>[Email]</w:t>
+      </w:r>
+    </w:p>
+    <w:p>
+      <w:pPr>
+        <w:jc w:val="center"/>
+      </w:pPr>
+      <w:r>
+        <w:rPr>
+          <w:rFonts w:ascii="Times New Roman" w:hAnsi="Times New Roman"/>
+          <w:b w:val="0"/>
+          <w:i/>
+          <w:sz w:val="20"/>
+        </w:rPr>
+        <w:t>This study is predictive and correlational. It makes no causal, production-deployment, or real-dispatch claims.</w:t>
+      </w:r>
+    </w:p>
+    <w:p>
+      <w:pPr>
+        <w:keepNext/>
         <w:spacing w:before="240" w:after="120"/>
       </w:pPr>
       <w:r>
@@ -55,11 +98,12 @@
           <w:i w:val="0"/>
           <w:sz w:val="24"/>
         </w:rPr>
-        <w:t>Day-ahead forecasts of municipal service-request volume are a natural input to staffing and dispatch planning, yet a reduction in average forecast error does not automatically translate into better operational decisions. We ask, on real data, two questions: do public external signals improve next-day forecasts of NYC 311 service-request volume, and does any improvement carry through to a stylized staffing-allocation simulation? Using real NYC 311 Service Requests for 2022-2024 (9,851,452 raw records aggregated to 43,240 date x borough x complaint_group observations) and real NOAA Central Park daily weather, we compare four feature sets - internal_historical, calendar_augmented, weather_augmented, and calendar_weather_augmented - across four model families under a strictly chronological protocol with five-fold rolling-origin validation. Calendar features deliver the largest accuracy gain; real weather adds a smaller but consistent further gain. The best model, a random forest on calendar_weather_augmented, attains a held-out test mean absolute error (MAE) of 55.325 versus 71.848 for a naive seasonal baseline, a 23.0% reduction. A stylized proportional staffing simulation shows the augmented policy reduces weighted unmet demand at every crew budget tested and closes 26.381% of the gap to an oracle at the baseline budget, but the magnitude of the decision benefit is budget-dependent. The central finding is that the forecast gains are real and robust, while the decision gains are smaller and conditional on capacity. The work is a reproducible baseline; no synthetic data or synthetic weather is used.</w:t>
+        <w:t>Day-ahead forecasts of municipal service-request volume are a natural input to staffing and dispatch planning, yet a reduction in average forecast error does not automatically translate into better operational decisions. We ask, on real data, two questions: do public external signals improve next-day forecasts of NYC 311 service-request volume, and does any improvement carry through to a stylized staffing-allocation simulation? Using real NYC 311 Service Requests for 2022-2024 (9,851,452 raw records aggregated to 43,240 date × borough × complaint-group observations) and real NOAA Central Park daily weather, we compare four feature sets - internal history, calendar, weather, and calendar + weather - across four model families under a strictly chronological protocol with five-fold rolling-origin validation. Calendar features deliver the largest accuracy gain; real weather adds a smaller but consistent further gain. The best model, a random forest on the calendar + weather feature set, attains a held-out test mean absolute error (MAE) of 55.325 versus 71.848 for a naive seasonal baseline, a 23.0% reduction. A stylized proportional staffing simulation shows the augmented policy reduces weighted unmet demand at every crew budget tested and closes 26.381% of the gap to an oracle at the baseline budget, but the magnitude of the decision benefit is budget-dependent. The central finding is that the forecast gains are real and robust, while the decision gains are smaller and conditional on capacity. This work provides a reproducible baseline; no synthetic data or synthetic weather is used.</w:t>
       </w:r>
     </w:p>
     <w:p>
       <w:pPr>
+        <w:keepNext/>
         <w:spacing w:before="240" w:after="120"/>
       </w:pPr>
       <w:r>
@@ -111,11 +155,12 @@
           <w:i w:val="0"/>
           <w:sz w:val="24"/>
         </w:rPr>
-        <w:t>We make three contributions. (i) A reproducible, real-data baseline on NYC 311 augmented with real NOAA weather, with a leakage-controlled chronological protocol. (ii) An honest four-way feature-set comparison isolating the marginal value of calendar features and of real weather. (iii) A transparent forecast-to-decision simulation that measures whether forecast gains transfer to a stylized allocation, with the result reported as it is: directionally positive but budget-dependent. The study is predictive and correlational and is positioned as an arXiv/workshop artifact, not a full paper; gating items for a stronger paper are stated in Section 8.</w:t>
+        <w:t>We make three contributions. (i) A reproducible, real-data baseline on NYC 311 augmented with real NOAA weather, with a leakage-controlled chronological protocol. (ii) A controlled four-way feature-set comparison isolating the marginal value of calendar features and of real weather. (iii) A transparent forecast-to-decision simulation that measures whether forecast gains transfer to a stylized allocation, with the result reported as it is: directionally positive but budget-dependent. The study is predictive and correlational; Section 8 states the scope of the analysis and the natural directions for extending it.</w:t>
       </w:r>
     </w:p>
     <w:p>
       <w:pPr>
+        <w:keepNext/>
         <w:spacing w:before="240" w:after="120"/>
       </w:pPr>
       <w:r>
@@ -158,6 +203,7 @@
     </w:p>
     <w:p>
       <w:pPr>
+        <w:keepNext/>
         <w:spacing w:before="240" w:after="120"/>
       </w:pPr>
       <w:r>
@@ -204,7 +250,7 @@
           <w:i w:val="0"/>
           <w:sz w:val="24"/>
         </w:rPr>
-        <w:t xml:space="preserve"> (NYC Open Data, Socrata dataset erm2-nwe9, “311 Service Requests from 2010 to Present”; City of New York, 2026), restricted to 2022-2024. From 9,851,452 raw records the pipeline produces a 43,240-row date x borough x complaint_group panel spanning observed dates 2022-01-15 to 2024-12-30 (after lag and rolling warmup). Records are mapped to eight complaint groups (Housing, Noise, Other, Public Safety, Sanitation, Street Condition, Traffic, Water) by a deterministic substring rule and aggregated to daily counts over the five NYC boroughs. The forecasting target is request_volume_next_day, the observed next-day request count per cell, defined only when consecutive calendar days are present.</w:t>
+        <w:t xml:space="preserve"> (NYC Open Data, Socrata dataset erm2-nwe9, “311 Service Requests from 2010 to Present”; City of New York, accessed 2026), restricted to 2022-2024. From 9,851,452 raw records the preprocessing procedure yields a 43,240-row date × borough × complaint-group panel spanning observed dates 2022-01-15 to 2024-12-30 (after lag and rolling warmup). Records are mapped to eight complaint groups (Housing, Noise, Other, Public Safety, Sanitation, Street Condition, Traffic, Water) by a deterministic substring rule and aggregated to daily counts over the five NYC boroughs. The forecasting target is the observed next-day request count per cell, defined only when consecutive calendar days are present.</w:t>
       </w:r>
     </w:p>
     <w:p>
@@ -227,11 +273,12 @@
           <w:i w:val="0"/>
           <w:sz w:val="24"/>
         </w:rPr>
-        <w:t xml:space="preserve"> (NOAA NCEI, 2026), station USW00094728 (NY City Central Park), 2022-2024, 1,096 daily rows. Variables used: precipitation, daily maximum and minimum temperature, average temperature, snowfall, snow depth, and wind speed. The source average-temperature field was empty for this station, so average temperature is derived as the mean of observed daily maximum and minimum; five missing wind-speed days are filled by time interpolation of neighbouring real observations. A single Central Park station is used as a city-level proxy, a documented spatial-resolution limitation.</w:t>
+        <w:t xml:space="preserve"> (NOAA NCEI, accessed 2026), station USW00094728 (NY City Central Park), 2022-2024, 1,096 daily rows. Variables used: precipitation, daily maximum and minimum temperature, average temperature, snowfall, snow depth, and wind speed. The source average-temperature field was empty for this station, so average temperature is derived as the mean of observed daily maximum and minimum; five missing wind-speed days are filled by time interpolation of neighbouring real observations. A single Central Park station is used as a city-level proxy, a documented spatial-resolution limitation.</w:t>
       </w:r>
     </w:p>
     <w:p>
       <w:pPr>
+        <w:keepNext/>
         <w:spacing w:before="160"/>
       </w:pPr>
       <w:r>
@@ -256,6 +303,10 @@
         <w:gridCol w:w="4680"/>
       </w:tblGrid>
       <w:tr>
+        <w:trPr>
+          <w:tblHeader w:val="true"/>
+          <w:cantSplit/>
+        </w:trPr>
         <w:tc>
           <w:tcPr>
             <w:tcW w:type="dxa" w:w="4680"/>
@@ -292,6 +343,9 @@
         </w:tc>
       </w:tr>
       <w:tr>
+        <w:trPr>
+          <w:cantSplit/>
+        </w:trPr>
         <w:tc>
           <w:tcPr>
             <w:tcW w:type="dxa" w:w="4680"/>
@@ -328,6 +382,9 @@
         </w:tc>
       </w:tr>
       <w:tr>
+        <w:trPr>
+          <w:cantSplit/>
+        </w:trPr>
         <w:tc>
           <w:tcPr>
             <w:tcW w:type="dxa" w:w="4680"/>
@@ -364,6 +421,9 @@
         </w:tc>
       </w:tr>
       <w:tr>
+        <w:trPr>
+          <w:cantSplit/>
+        </w:trPr>
         <w:tc>
           <w:tcPr>
             <w:tcW w:type="dxa" w:w="4680"/>
@@ -400,6 +460,9 @@
         </w:tc>
       </w:tr>
       <w:tr>
+        <w:trPr>
+          <w:cantSplit/>
+        </w:trPr>
         <w:tc>
           <w:tcPr>
             <w:tcW w:type="dxa" w:w="4680"/>
@@ -430,12 +493,15 @@
                 <w:i w:val="0"/>
                 <w:sz w:val="20"/>
               </w:rPr>
-              <w:t>43,240 (date x borough x complaint_group)</w:t>
+              <w:t>43,240 (date × borough × complaint-group)</w:t>
             </w:r>
           </w:p>
         </w:tc>
       </w:tr>
       <w:tr>
+        <w:trPr>
+          <w:cantSplit/>
+        </w:trPr>
         <w:tc>
           <w:tcPr>
             <w:tcW w:type="dxa" w:w="4680"/>
@@ -472,6 +538,9 @@
         </w:tc>
       </w:tr>
       <w:tr>
+        <w:trPr>
+          <w:cantSplit/>
+        </w:trPr>
         <w:tc>
           <w:tcPr>
             <w:tcW w:type="dxa" w:w="4680"/>
@@ -508,6 +577,9 @@
         </w:tc>
       </w:tr>
       <w:tr>
+        <w:trPr>
+          <w:cantSplit/>
+        </w:trPr>
         <w:tc>
           <w:tcPr>
             <w:tcW w:type="dxa" w:w="4680"/>
@@ -538,12 +610,15 @@
                 <w:i w:val="0"/>
                 <w:sz w:val="20"/>
               </w:rPr>
-              <w:t>request_volume_next_day (observed next-day count)</w:t>
+              <w:t>Observed next-day request count per cell</w:t>
             </w:r>
           </w:p>
         </w:tc>
       </w:tr>
       <w:tr>
+        <w:trPr>
+          <w:cantSplit/>
+        </w:trPr>
         <w:tc>
           <w:tcPr>
             <w:tcW w:type="dxa" w:w="4680"/>
@@ -580,6 +655,9 @@
         </w:tc>
       </w:tr>
       <w:tr>
+        <w:trPr>
+          <w:cantSplit/>
+        </w:trPr>
         <w:tc>
           <w:tcPr>
             <w:tcW w:type="dxa" w:w="4680"/>
@@ -616,6 +694,9 @@
         </w:tc>
       </w:tr>
       <w:tr>
+        <w:trPr>
+          <w:cantSplit/>
+        </w:trPr>
         <w:tc>
           <w:tcPr>
             <w:tcW w:type="dxa" w:w="4680"/>
@@ -652,6 +733,9 @@
         </w:tc>
       </w:tr>
       <w:tr>
+        <w:trPr>
+          <w:cantSplit/>
+        </w:trPr>
         <w:tc>
           <w:tcPr>
             <w:tcW w:type="dxa" w:w="4680"/>
@@ -691,6 +775,7 @@
     <w:p/>
     <w:p>
       <w:pPr>
+        <w:keepNext/>
         <w:spacing w:before="240" w:after="120"/>
       </w:pPr>
       <w:r>
@@ -714,7 +799,7 @@
           <w:i w:val="0"/>
           <w:sz w:val="24"/>
         </w:rPr>
-        <w:t>We compare four feature sets: internal_historical (lag and rolling statistics of the per-cell series), calendar_augmented (internal plus deterministic calendar features), weather_augmented (internal plus the seven real weather variables), and calendar_weather_augmented (internal plus calendar plus weather). Full feature definitions are in Appendix A.</w:t>
+        <w:t>We compare four feature sets: internal history (lag and rolling statistics of the per-cell series), calendar (internal plus deterministic calendar features), weather (internal plus the seven real weather variables), and calendar + weather (internal plus calendar plus weather). The corresponding configuration identifiers used in the results tables are internal_historical, calendar_augmented, weather_augmented, and calendar_weather_augmented. Full feature definitions are in Appendix A.</w:t>
       </w:r>
     </w:p>
     <w:p>
@@ -728,7 +813,7 @@
           <w:i w:val="0"/>
           <w:sz w:val="24"/>
         </w:rPr>
-        <w:t>Four model families are evaluated: a naive seasonal baseline (trailing 7-day mean), Ridge regression, a random forest, and gradient boosting. Categorical features (borough, complaint_group) are one-hot encoded; numeric features pass through. Lag and rolling features use only past observations, with rolling statistics shifted by one day to avoid same-day or future leakage.</w:t>
+        <w:t>Four model families are evaluated: a naive seasonal baseline (trailing 7-day mean), Ridge regression, a random forest, and gradient boosting. Categorical features (borough, complaint group) are one-hot encoded; numeric features pass through. Lag and rolling features use only past observations, with rolling statistics shifted by one day to avoid same-day or future leakage.</w:t>
       </w:r>
     </w:p>
     <w:p>
@@ -742,7 +827,7 @@
           <w:i w:val="0"/>
           <w:sz w:val="24"/>
         </w:rPr>
-        <w:t>Validation uses a strictly chronological split by date: the earliest 70% of dates for training (30,240 rows), the next 15% for validation (6,480 rows), and the latest 15% for test (6,520 rows). The primary metric is MAE; RMSE, MAPE (with safe handling of near-zero actuals), and R-squared are also reported. The best configuration by validation MAE is refit on train+validation before the final test evaluation. Separately, five expanding-window rolling-origin folds assess stability.</w:t>
+        <w:t>Validation uses a strictly chronological split by date: the earliest 70% of dates for training (30,240 rows), the next 15% for validation (6,480 rows), and the latest 15% for test (6,520 rows). The primary metric is MAE; RMSE, MAPE (computed with the denominator floored at one request, so that near-zero actual counts do not inflate the percentage error), and R² are also reported. The best configuration by validation MAE is refit on train + validation before the final test evaluation. Separately, five expanding-window rolling-origin folds assess stability.</w:t>
       </w:r>
     </w:p>
     <w:p>
@@ -761,6 +846,7 @@
     </w:p>
     <w:p>
       <w:pPr>
+        <w:keepNext/>
         <w:spacing w:before="240" w:after="120"/>
       </w:pPr>
       <w:r>
@@ -784,11 +870,12 @@
           <w:i w:val="0"/>
           <w:sz w:val="24"/>
         </w:rPr>
-        <w:t>Calendar augmentation improves test MAE for every model, and real weather adds a smaller consistent gain on top of it. For the random forest, MAE falls from 65.282 (internal_historical) to 58.082 (calendar_augmented); weather alone improves the internal model (64.104 versus 65.282), and calendar+weather is best (56.224 on the train-only fit). Ridge does not benefit from weather (internal 69.219, weather 69.283, calendar+weather 68.915). Figure 2 shows the best test MAE per feature set; the full per-model results are in Table 3 (trimmed below; complete table in Appendix G).</w:t>
+        <w:t>Calendar augmentation improves test MAE for every model, and real weather adds a smaller consistent gain on top of it. For the random forest, MAE falls from 65.282 (internal history) to 58.082 (calendar); weather alone improves the internal-history model (64.104 versus 65.282), and calendar + weather is best, at 56.224 for the single-split model fit on the training set only. Ridge does not benefit from weather (internal 69.219, weather 69.283, calendar + weather 68.915). Figure 1 shows the best test MAE per feature set; the full per-model results are in Table 2 (selected rows are reported below; the complete table is in Appendix G).</w:t>
       </w:r>
     </w:p>
     <w:p>
       <w:pPr>
+        <w:keepNext/>
         <w:spacing w:before="160"/>
       </w:pPr>
       <w:r>
@@ -798,7 +885,7 @@
           <w:i w:val="0"/>
           <w:sz w:val="22"/>
         </w:rPr>
-        <w:t>Table 3 (selected rows). Held-out test MAE by model and feature set; lower is better. Full 13-row table in Appendix G.</w:t>
+        <w:t>Table 2 (selected rows). Held-out test MAE by model and feature set; lower is better. Full 13-row table in Appendix G.</w:t>
       </w:r>
     </w:p>
     <w:tbl>
@@ -814,6 +901,10 @@
         <w:gridCol w:w="3120"/>
       </w:tblGrid>
       <w:tr>
+        <w:trPr>
+          <w:tblHeader w:val="true"/>
+          <w:cantSplit/>
+        </w:trPr>
         <w:tc>
           <w:tcPr>
             <w:tcW w:type="dxa" w:w="3120"/>
@@ -867,6 +958,9 @@
         </w:tc>
       </w:tr>
       <w:tr>
+        <w:trPr>
+          <w:cantSplit/>
+        </w:trPr>
         <w:tc>
           <w:tcPr>
             <w:tcW w:type="dxa" w:w="3120"/>
@@ -920,6 +1014,9 @@
         </w:tc>
       </w:tr>
       <w:tr>
+        <w:trPr>
+          <w:cantSplit/>
+        </w:trPr>
         <w:tc>
           <w:tcPr>
             <w:tcW w:type="dxa" w:w="3120"/>
@@ -973,6 +1070,9 @@
         </w:tc>
       </w:tr>
       <w:tr>
+        <w:trPr>
+          <w:cantSplit/>
+        </w:trPr>
         <w:tc>
           <w:tcPr>
             <w:tcW w:type="dxa" w:w="3120"/>
@@ -1026,6 +1126,9 @@
         </w:tc>
       </w:tr>
       <w:tr>
+        <w:trPr>
+          <w:cantSplit/>
+        </w:trPr>
         <w:tc>
           <w:tcPr>
             <w:tcW w:type="dxa" w:w="3120"/>
@@ -1079,6 +1182,9 @@
         </w:tc>
       </w:tr>
       <w:tr>
+        <w:trPr>
+          <w:cantSplit/>
+        </w:trPr>
         <w:tc>
           <w:tcPr>
             <w:tcW w:type="dxa" w:w="3120"/>
@@ -1132,6 +1238,9 @@
         </w:tc>
       </w:tr>
       <w:tr>
+        <w:trPr>
+          <w:cantSplit/>
+        </w:trPr>
         <w:tc>
           <w:tcPr>
             <w:tcW w:type="dxa" w:w="3120"/>
@@ -1185,6 +1294,9 @@
         </w:tc>
       </w:tr>
       <w:tr>
+        <w:trPr>
+          <w:cantSplit/>
+        </w:trPr>
         <w:tc>
           <w:tcPr>
             <w:tcW w:type="dxa" w:w="3120"/>
@@ -1250,11 +1362,14 @@
           <w:i w:val="0"/>
           <w:sz w:val="24"/>
         </w:rPr>
-        <w:t>The selected model (by validation MAE, refit on train+validation) is the random forest on calendar_weather_augmented, with held-out test MAE 55.325, RMSE 177.476, MAPE 27.469%, and R-squared 0.648 - a 23.0% MAE reduction over the naive seasonal baseline (71.848). Figure 7 shows observed versus predicted city-wide next-day totals over the test period, which track the overall level and weekly pattern of demand.</w:t>
+        <w:t>The selected configuration by validation MAE is the random forest on calendar + weather. Refit on train + validation and evaluated once on the held-out test set, it attains test MAE 55.325, RMSE 177.476, MAPE 27.469%, and R² 0.648 - a 23.0% MAE reduction over the naive seasonal baseline (71.848). The selected-model test MAE of 55.325 (refit on train + validation) is therefore slightly lower than the 56.224 obtained from the train-only fit on the single split. Figure 2 shows observed versus predicted city-wide next-day totals over the test period, which track the overall level and weekly pattern of demand.</w:t>
       </w:r>
     </w:p>
     <w:p>
       <w:pPr>
+        <w:keepNext/>
+        <w:keepLines/>
+        <w:spacing w:before="120"/>
         <w:jc w:val="center"/>
       </w:pPr>
       <w:r>
@@ -1294,6 +1409,7 @@
     </w:p>
     <w:p>
       <w:pPr>
+        <w:keepLines/>
         <w:jc w:val="center"/>
       </w:pPr>
       <w:r>
@@ -1303,11 +1419,14 @@
           <w:i/>
           <w:sz w:val="20"/>
         </w:rPr>
-        <w:t>Figure 2. Best test MAE achieved per feature set across models.</w:t>
+        <w:t>Figure 1. Best held-out test MAE achieved per feature set across models.</w:t>
       </w:r>
     </w:p>
     <w:p>
       <w:pPr>
+        <w:keepNext/>
+        <w:keepLines/>
+        <w:spacing w:before="120"/>
         <w:jc w:val="center"/>
       </w:pPr>
       <w:r>
@@ -1347,6 +1466,7 @@
     </w:p>
     <w:p>
       <w:pPr>
+        <w:keepLines/>
         <w:jc w:val="center"/>
       </w:pPr>
       <w:r>
@@ -1356,11 +1476,12 @@
           <w:i/>
           <w:sz w:val="20"/>
         </w:rPr>
-        <w:t>Figure 7. Observed vs predicted city-wide next-day request totals over the test period for the best model.</w:t>
+        <w:t>Figure 2. Observed versus predicted city-wide next-day request totals over the test period for the selected model.</w:t>
       </w:r>
     </w:p>
     <w:p>
       <w:pPr>
+        <w:keepNext/>
         <w:spacing w:before="240" w:after="120"/>
       </w:pPr>
       <w:r>
@@ -1384,7 +1505,7 @@
           <w:i w:val="0"/>
           <w:sz w:val="24"/>
         </w:rPr>
-        <w:t>At the baseline budget (135 crews, 50 requests per crew, 163 test days), total weighted unmet demand is 643,324 under the internal-historical policy and 631,191 under calendar+weather, versus an oracle of 597,332: the augmented policy reduces weighted unmet demand by 1.886% and closes 26.381% of the baseline-to-oracle gap.</w:t>
+        <w:t>At the baseline budget (135 crews, 50 requests per crew, 163 test days), total weighted unmet demand is 643,324 under the internal-history policy and 631,191 under calendar + weather, versus an oracle of 597,332: the augmented policy reduces weighted unmet demand by 1.886% and closes 26.381% of the baseline-to-oracle gap.</w:t>
       </w:r>
     </w:p>
     <w:p>
@@ -1398,11 +1519,12 @@
           <w:i w:val="0"/>
           <w:sz w:val="24"/>
         </w:rPr>
-        <w:t>Across crew budgets (Table 7, Figure 6) the calendar+weather policy is better than the baseline in all three settings, but the magnitude grows with capacity: the weighted-unmet reduction is 0.38% (scarce, 100 crews), 4.32% (moderate, 160), and 14.53% (generous, 220). The headline contrast - an approximately 11-15% forecast-accuracy gain versus a roughly 1.9% decision-quality gain at the baseline budget - is the central observation: average accuracy and operational value are not the same, and a scarce budget with demand concentrated in a few large cells limits how much any forecast can help.</w:t>
+        <w:t>Across crew budgets (Table 3, Figure 3) the calendar + weather policy is better than the baseline in all three settings, but the magnitude grows with capacity: the weighted-unmet reduction is 0.38% (scarce, 100 crews), 4.32% (moderate, 160), and 14.53% (generous, 220). The headline contrast - an approximately 11-15% forecast-accuracy gain versus a roughly 1.9% decision-quality gain at the baseline budget - is the central observation: average accuracy and operational value are not the same, and a scarce budget with demand concentrated in a few large cells limits how much any forecast can help.</w:t>
       </w:r>
     </w:p>
     <w:p>
       <w:pPr>
+        <w:keepNext/>
         <w:spacing w:before="160"/>
       </w:pPr>
       <w:r>
@@ -1412,7 +1534,7 @@
           <w:i w:val="0"/>
           <w:sz w:val="22"/>
         </w:rPr>
-        <w:t>Table 7. Decision sensitivity by crew budget. Stylized simulation; total weighted unmet demand (lower is better); calendar+weather versus internal-historical.</w:t>
+        <w:t>Table 3. Decision sensitivity by crew budget. Stylized simulation; total weighted unmet demand (lower is better); calendar + weather versus internal history.</w:t>
       </w:r>
     </w:p>
     <w:tbl>
@@ -1432,6 +1554,10 @@
         <w:gridCol w:w="1337"/>
       </w:tblGrid>
       <w:tr>
+        <w:trPr>
+          <w:tblHeader w:val="true"/>
+          <w:cantSplit/>
+        </w:trPr>
         <w:tc>
           <w:tcPr>
             <w:tcW w:type="dxa" w:w="1337"/>
@@ -1547,12 +1673,15 @@
                 <w:i w:val="0"/>
                 <w:sz w:val="20"/>
               </w:rPr>
-              <w:t>Gap to oracle closed</w:t>
+              <w:t>Oracle gap closed</w:t>
             </w:r>
           </w:p>
         </w:tc>
       </w:tr>
       <w:tr>
+        <w:trPr>
+          <w:cantSplit/>
+        </w:trPr>
         <w:tc>
           <w:tcPr>
             <w:tcW w:type="dxa" w:w="1337"/>
@@ -1674,6 +1803,9 @@
         </w:tc>
       </w:tr>
       <w:tr>
+        <w:trPr>
+          <w:cantSplit/>
+        </w:trPr>
         <w:tc>
           <w:tcPr>
             <w:tcW w:type="dxa" w:w="1337"/>
@@ -1795,6 +1927,9 @@
         </w:tc>
       </w:tr>
       <w:tr>
+        <w:trPr>
+          <w:cantSplit/>
+        </w:trPr>
         <w:tc>
           <w:tcPr>
             <w:tcW w:type="dxa" w:w="1337"/>
@@ -1919,6 +2054,9 @@
     <w:p/>
     <w:p>
       <w:pPr>
+        <w:keepNext/>
+        <w:keepLines/>
+        <w:spacing w:before="120"/>
         <w:jc w:val="center"/>
       </w:pPr>
       <w:r>
@@ -1958,6 +2096,7 @@
     </w:p>
     <w:p>
       <w:pPr>
+        <w:keepLines/>
         <w:jc w:val="center"/>
       </w:pPr>
       <w:r>
@@ -1967,11 +2106,12 @@
           <w:i/>
           <w:sz w:val="20"/>
         </w:rPr>
-        <w:t>Figure 6. Total weighted unmet demand by policy under scarce, moderate, and generous crew budgets.</w:t>
+        <w:t>Figure 3. Total weighted unmet demand by policy under scarce, moderate, and generous crew budgets.</w:t>
       </w:r>
     </w:p>
     <w:p>
       <w:pPr>
+        <w:keepNext/>
         <w:spacing w:before="240" w:after="120"/>
       </w:pPr>
       <w:r>
@@ -1995,11 +2135,14 @@
           <w:i w:val="0"/>
           <w:sz w:val="24"/>
         </w:rPr>
-        <w:t>Five-fold expanding-window rolling-origin validation (Figure 3; full table in Appendix C) shows calendar augmentation lowering MAE in every fold for every model: mean improvement 15.13% for the random forest, 9.94% for gradient boosting, and 0.94% for Ridge, each in all 5 of 5 folds. The calendar_weather_augmented random forest has the lowest mean fold MAE (47.497). Segmented analysis (random forest, internal vs calendar; Appendix G) shows the improvement holds for all five boroughs (about 8.8% to 18.8%) and all eight complaint groups (about 8.9% to 25.8%); absolute error concentrates in the highest-volume segments (Noise, Housing; the Bronx). The forecast improvement is therefore consistent across folds and segments, not an artifact of one split.</w:t>
+        <w:t>Five-fold expanding-window rolling-origin validation (Figure 4; full table in Appendix C) shows calendar augmentation lowering MAE in every fold for every model: mean improvement 15.13% for the random forest, 9.94% for gradient boosting, and 0.94% for Ridge, each in all 5 of 5 folds. The calendar + weather random forest has the lowest mean fold MAE (47.497). Segmented analysis (random forest, internal history versus calendar; Appendix G) shows the improvement holds for all five boroughs (about 8.8% to 18.8%) and all eight complaint groups (about 8.9% to 25.8%); absolute error concentrates in the highest-volume segments (Noise, Housing; the Bronx). The forecast improvement is therefore consistent across folds and segments, not an artifact of one split.</w:t>
       </w:r>
     </w:p>
     <w:p>
       <w:pPr>
+        <w:keepNext/>
+        <w:keepLines/>
+        <w:spacing w:before="120"/>
         <w:jc w:val="center"/>
       </w:pPr>
       <w:r>
@@ -2039,6 +2182,7 @@
     </w:p>
     <w:p>
       <w:pPr>
+        <w:keepLines/>
         <w:jc w:val="center"/>
       </w:pPr>
       <w:r>
@@ -2048,11 +2192,12 @@
           <w:i/>
           <w:sz w:val="20"/>
         </w:rPr>
-        <w:t>Figure 3. Per-fold test MAE by configuration across five expanding-window chronological folds.</w:t>
+        <w:t>Figure 4. Per-fold test MAE by configuration across five expanding-window chronological folds.</w:t>
       </w:r>
     </w:p>
     <w:p>
       <w:pPr>
+        <w:keepNext/>
         <w:spacing w:before="240" w:after="120"/>
       </w:pPr>
       <w:r>
@@ -2076,7 +2221,7 @@
           <w:i w:val="0"/>
           <w:sz w:val="24"/>
         </w:rPr>
-        <w:t>The study is predictive and correlational and makes no causal claim. NYC 311 reflects reporting behaviour, not true incidence (reporting bias), so forecasts predict reported volume. Weather is a single Central Park station used as a city-level proxy. Borough-level aggregation hides within-borough variation; the complaint-group mapping is a deterministic approximation with a residual Other group. No transit or event data is included. The staffing simulation is a stylized proportional heuristic - not real dispatch, not staffing optimization, not validated against any real policy - and omits crew travel, shifts, backlog, intra-day timing, and substitution; it uses no observed dispatch decisions. Results apply to NYC and 2022-2024 only.</w:t>
+        <w:t>The study is predictive and correlational and makes no causal claim. NYC 311 reflects reporting behaviour, not true incidence (reporting bias), so forecasts predict reported volume. Weather is a single Central Park station used as a city-level proxy. Borough-level aggregation hides within-borough variation; the complaint-group mapping is a deterministic approximation with a residual Other group. No transit or event data is included. The staffing simulation is a stylized proportional heuristic - it omits crew travel, shifts, backlog, intra-day timing, and substitution, and it uses no observed dispatch decisions. Results apply to NYC and 2022-2024 only.</w:t>
       </w:r>
     </w:p>
     <w:p>
@@ -2090,11 +2235,12 @@
           <w:i w:val="0"/>
           <w:sz w:val="24"/>
         </w:rPr>
-        <w:t>Gating items for a stronger (full) paper: a non-stylized, agency-grounded decision model with an empirical service-level realism check; formal forecast-difference testing (for example a Diebold-Mariano test) with uncertainty intervals; and broader external signals beyond a single weather station, or cross-city replication.</w:t>
+        <w:t>Natural extensions of this work: a non-stylized, agency-grounded decision model with an empirical service-level realism check; formal forecast-difference testing (for example a Diebold-Mariano test) with uncertainty intervals; and broader external signals beyond a single weather station, or cross-city replication.</w:t>
       </w:r>
     </w:p>
     <w:p>
       <w:pPr>
+        <w:keepNext/>
         <w:spacing w:before="240" w:after="120"/>
       </w:pPr>
       <w:r>
@@ -2118,11 +2264,12 @@
           <w:i w:val="0"/>
           <w:sz w:val="24"/>
         </w:rPr>
-        <w:t>On real NYC 311 data augmented with real NOAA weather, public-signal augmentation consistently improves next-day service-demand forecasts - calendar most, weather a smaller consistent increment - across rolling folds, boroughs, and complaint groups. The improvement transfers in direction to a stylized staffing allocation but with attenuated, budget-dependent magnitude. The forecast gains are real and robust; the decision gains are smaller and conditional on capacity. The artifact is a reproducible baseline suitable as a workshop / short-paper / arXiv-style contribution.</w:t>
+        <w:t>On real NYC 311 data augmented with real NOAA weather, public-signal augmentation consistently improves next-day service-demand forecasts - calendar most, weather a smaller consistent increment - across rolling folds, boroughs, and complaint groups. The improvement transfers in direction to a stylized staffing allocation but with attenuated, budget-dependent magnitude. The forecast gains are real and robust; the decision gains are smaller and conditional on capacity. This provides a reproducible baseline for forecast-to-decision evaluation in municipal service operations.</w:t>
       </w:r>
     </w:p>
     <w:p>
       <w:pPr>
+        <w:keepNext/>
         <w:spacing w:before="240" w:after="120"/>
       </w:pPr>
       <w:r>
@@ -2146,11 +2293,12 @@
           <w:i w:val="0"/>
           <w:sz w:val="24"/>
         </w:rPr>
-        <w:t>All values are read from committed artifacts under reports/ and data/metadata/. The pipeline is run with python -m src.weather, python -m src.build_dataset, python -m src.train, python -m src.evaluate, python -m src.decision_simulation, python -m src.monitor, python -m src.rolling_validation, python -m src.robustness_analysis, python -m src.decision_sensitivity, and python -m src.practical_significance, on Python 3.11. The quality gate is ruff check . and pytest, run offline on a committed real-schema sample; continuous integration runs the pipeline in that sample mode. No API keys or secrets are required. The committed inputs are the aggregated real daily counts and the real NOAA weather export; the large raw monthly exports and the trained model binary are not committed.</w:t>
+        <w:t>All reported values derive from the analysis described in Sections 3-7, run on Python 3.11 with fixed random seeds. The analysis comprises weather ingestion, dataset construction, model training, evaluation, the decision simulation, rolling-origin validation, per-segment robustness analysis, crew-budget sensitivity, and practical-significance summaries; each stage is fully automated and reproducible from the public data sources. The aggregated real daily counts and the real NOAA weather export are retained as inputs; the large raw monthly exports and the trained model are regenerable from the public sources.</w:t>
       </w:r>
     </w:p>
     <w:p>
       <w:pPr>
+        <w:keepNext/>
         <w:spacing w:before="240" w:after="120"/>
       </w:pPr>
       <w:r>
@@ -2174,11 +2322,12 @@
           <w:i w:val="0"/>
           <w:sz w:val="24"/>
         </w:rPr>
-        <w:t>NYC 311 Service Requests are public via NYC Open Data (Socrata dataset erm2-nwe9; City of New York, 2026). NOAA NCEI Daily Summaries (GHCN-Daily) for station USW00094728 are public (NOAA NCEI, 2026). The study window is 2022-2024. The aggregated daily counts and the NOAA export used here are committed; the large raw monthly 311 exports and the processed modelling dataset are regenerable and not committed; small real-schema samples are committed for continuous integration. No synthetic data and no synthetic weather are used.</w:t>
+        <w:t>NYC 311 Service Requests are publicly available via NYC Open Data (Socrata dataset erm2-nwe9; City of New York, accessed 2026). NOAA NCEI Daily Summaries (GHCN-Daily) for station USW00094728 are publicly available (NOAA NCEI, accessed 2026). The study window is 2022-2024. The aggregated daily counts and the NOAA weather export used here are provided with the analysis materials; the large raw monthly 311 exports and the processed modelling dataset are regenerable from the public sources. No synthetic data and no synthetic weather are used.</w:t>
       </w:r>
     </w:p>
     <w:p>
       <w:pPr>
+        <w:keepNext/>
         <w:spacing w:before="240" w:after="120"/>
       </w:pPr>
       <w:r>
@@ -2202,7 +2351,7 @@
           <w:i w:val="0"/>
           <w:sz w:val="24"/>
         </w:rPr>
-        <w:t>The study uses public data only, at an aggregate date x borough x complaint_group level; no individual-level records and no personal data are used or produced. It makes no individual-level decisions, is not deployed, and is not public-safety software. It makes no causal claim and no real dispatch or staffing optimization claim. NYC 311 reflects reporting behaviour, not true incidence; reporting propensity varies across communities and time, so forecasts of 311 volume are forecasts of reporting, not of need, and must not be read as measures of true demand or used in ways that could compound existing inequities.</w:t>
+        <w:t>The study uses public data only, at an aggregate date × borough × complaint-group level; no individual-level records and no personal data are used or produced. It makes no individual-level decisions and is not a deployed system. It makes no causal claim and no real dispatch or staffing-optimization claim. NYC 311 reflects reporting behaviour, not true incidence; reporting propensity varies across communities and time, so forecasts of 311 volume are forecasts of reporting, not of need, and must not be read as measures of true demand or used in ways that could compound existing inequities.</w:t>
       </w:r>
     </w:p>
     <w:p>
@@ -2212,6 +2361,7 @@
     </w:p>
     <w:p>
       <w:pPr>
+        <w:keepNext/>
         <w:spacing w:before="240" w:after="120"/>
       </w:pPr>
       <w:r>
@@ -2226,6 +2376,7 @@
     </w:p>
     <w:p>
       <w:pPr>
+        <w:keepNext/>
         <w:spacing w:before="240" w:after="120"/>
       </w:pPr>
       <w:r>
@@ -2249,11 +2400,12 @@
           <w:i w:val="0"/>
           <w:sz w:val="24"/>
         </w:rPr>
-        <w:t>Lag features (request_lag_1, request_lag_7) and rolling statistics (rolling_mean_7/14, rolling_std_7/14) per (borough, complaint_group) cell, using only past observations with a one-day shift. Calendar features: is_weekend, is_holiday, day_of_week, month, quarter, year, day_of_year, week_of_year, is_month_start, is_month_end. Weather features: precipitation_mm, temp_max_c, temp_min_c, temp_avg_c, snowfall_mm, snow_depth_mm, wind_speed_ms. Feature sets: internal_historical; calendar_augmented (internal + calendar); weather_augmented (internal + weather); calendar_weather_augmented (internal + calendar + weather). Table 2 lists the feature sets.</w:t>
+        <w:t>Lag features (request_lag_1, request_lag_7) and rolling statistics (rolling_mean_7/14, rolling_std_7/14) per (borough, complaint group) cell, using only past observations with a one-day shift. Calendar features: is_weekend, is_holiday, day_of_week, month, quarter, year, day_of_year, week_of_year, is_month_start, is_month_end. Weather features: precipitation_mm, temp_max_c, temp_min_c, temp_avg_c, snowfall_mm, snow_depth_mm, wind_speed_ms. The four feature sets - internal history (internal_historical), calendar (calendar_augmented), weather (weather_augmented), and calendar + weather (calendar_weather_augmented) - are listed in Table A1.</w:t>
       </w:r>
     </w:p>
     <w:p>
       <w:pPr>
+        <w:keepNext/>
         <w:spacing w:before="160"/>
       </w:pPr>
       <w:r>
@@ -2263,7 +2415,7 @@
           <w:i w:val="0"/>
           <w:sz w:val="22"/>
         </w:rPr>
-        <w:t>Table 2. Feature sets.</w:t>
+        <w:t>Table A1. Feature sets.</w:t>
       </w:r>
     </w:p>
     <w:tbl>
@@ -2278,6 +2430,10 @@
         <w:gridCol w:w="4680"/>
       </w:tblGrid>
       <w:tr>
+        <w:trPr>
+          <w:tblHeader w:val="true"/>
+          <w:cantSplit/>
+        </w:trPr>
         <w:tc>
           <w:tcPr>
             <w:tcW w:type="dxa" w:w="4680"/>
@@ -2314,6 +2470,9 @@
         </w:tc>
       </w:tr>
       <w:tr>
+        <w:trPr>
+          <w:cantSplit/>
+        </w:trPr>
         <w:tc>
           <w:tcPr>
             <w:tcW w:type="dxa" w:w="4680"/>
@@ -2350,6 +2509,9 @@
         </w:tc>
       </w:tr>
       <w:tr>
+        <w:trPr>
+          <w:cantSplit/>
+        </w:trPr>
         <w:tc>
           <w:tcPr>
             <w:tcW w:type="dxa" w:w="4680"/>
@@ -2386,6 +2548,9 @@
         </w:tc>
       </w:tr>
       <w:tr>
+        <w:trPr>
+          <w:cantSplit/>
+        </w:trPr>
         <w:tc>
           <w:tcPr>
             <w:tcW w:type="dxa" w:w="4680"/>
@@ -2422,6 +2587,9 @@
         </w:tc>
       </w:tr>
       <w:tr>
+        <w:trPr>
+          <w:cantSplit/>
+        </w:trPr>
         <w:tc>
           <w:tcPr>
             <w:tcW w:type="dxa" w:w="4680"/>
@@ -2461,6 +2629,7 @@
     <w:p/>
     <w:p>
       <w:pPr>
+        <w:keepNext/>
         <w:spacing w:before="240" w:after="120"/>
       </w:pPr>
       <w:r>
@@ -2489,6 +2658,7 @@
     </w:p>
     <w:p>
       <w:pPr>
+        <w:keepNext/>
         <w:spacing w:before="240" w:after="120"/>
       </w:pPr>
       <w:r>
@@ -2512,11 +2682,12 @@
           <w:i w:val="0"/>
           <w:sz w:val="24"/>
         </w:rPr>
-        <w:t>Chronological 70/15/15 split by date (30,240 / 6,480 / 6,520 rows). Five expanding-window rolling-origin folds; each fold trains on all dates up to a cut point and tests on the next block, with no future information in training. Per-fold metrics are in reports/rolling_validation_report.csv; the summary (Figure 3 source) is in reports/rolling_validation_summary.json. Table 4 reports the mean fold MAE.</w:t>
+        <w:t>Chronological 70/15/15 split by date (30,240 / 6,480 / 6,520 rows). Five expanding-window rolling-origin folds; each fold trains on all dates up to a cut point and tests on the next block, with no future information in training. Table A2 reports the mean fold MAE that underlies Figure 4.</w:t>
       </w:r>
     </w:p>
     <w:p>
       <w:pPr>
+        <w:keepNext/>
         <w:spacing w:before="160"/>
       </w:pPr>
       <w:r>
@@ -2526,7 +2697,7 @@
           <w:i w:val="0"/>
           <w:sz w:val="22"/>
         </w:rPr>
-        <w:t>Table 4. Rolling-origin validation: random-forest mean fold test MAE by feature set.</w:t>
+        <w:t>Table A2. Rolling-origin validation: random-forest mean fold test MAE by feature set.</w:t>
       </w:r>
     </w:p>
     <w:tbl>
@@ -2542,6 +2713,10 @@
         <w:gridCol w:w="3120"/>
       </w:tblGrid>
       <w:tr>
+        <w:trPr>
+          <w:tblHeader w:val="true"/>
+          <w:cantSplit/>
+        </w:trPr>
         <w:tc>
           <w:tcPr>
             <w:tcW w:type="dxa" w:w="3120"/>
@@ -2595,6 +2770,9 @@
         </w:tc>
       </w:tr>
       <w:tr>
+        <w:trPr>
+          <w:cantSplit/>
+        </w:trPr>
         <w:tc>
           <w:tcPr>
             <w:tcW w:type="dxa" w:w="3120"/>
@@ -2648,6 +2826,9 @@
         </w:tc>
       </w:tr>
       <w:tr>
+        <w:trPr>
+          <w:cantSplit/>
+        </w:trPr>
         <w:tc>
           <w:tcPr>
             <w:tcW w:type="dxa" w:w="3120"/>
@@ -2701,6 +2882,9 @@
         </w:tc>
       </w:tr>
       <w:tr>
+        <w:trPr>
+          <w:cantSplit/>
+        </w:trPr>
         <w:tc>
           <w:tcPr>
             <w:tcW w:type="dxa" w:w="3120"/>
@@ -2754,6 +2938,9 @@
         </w:tc>
       </w:tr>
       <w:tr>
+        <w:trPr>
+          <w:cantSplit/>
+        </w:trPr>
         <w:tc>
           <w:tcPr>
             <w:tcW w:type="dxa" w:w="3120"/>
@@ -2807,6 +2994,9 @@
         </w:tc>
       </w:tr>
       <w:tr>
+        <w:trPr>
+          <w:cantSplit/>
+        </w:trPr>
         <w:tc>
           <w:tcPr>
             <w:tcW w:type="dxa" w:w="3120"/>
@@ -2863,6 +3053,7 @@
     <w:p/>
     <w:p>
       <w:pPr>
+        <w:keepNext/>
         <w:spacing w:before="240" w:after="120"/>
       </w:pPr>
       <w:r>
@@ -2886,11 +3077,12 @@
           <w:i w:val="0"/>
           <w:sz w:val="24"/>
         </w:rPr>
-        <w:t>Stylized proportional allocation via a largest-remainder rule; baseline-budget configuration 135 crews x 50 requests per crew over 163 test days; weighted unmet demand up-weights Public Safety, Water, and Traffic; an oracle allocates on true next-day demand. Not real dispatch; uses no observed dispatch decisions.</w:t>
+        <w:t>Stylized proportional allocation via a largest-remainder rule; baseline-budget configuration 135 crews × 50 requests per crew over 163 test days; weighted unmet demand up-weights Public Safety, Water, and Traffic; an oracle allocates on true next-day demand. The simulation uses no observed dispatch decisions.</w:t>
       </w:r>
     </w:p>
     <w:p>
       <w:pPr>
+        <w:keepNext/>
         <w:spacing w:before="240" w:after="120"/>
       </w:pPr>
       <w:r>
@@ -2914,11 +3106,12 @@
           <w:i w:val="0"/>
           <w:sz w:val="24"/>
         </w:rPr>
-        <w:t>Three budgets - scarce (100 crews, 5,000 daily capacity), moderate (160 / 8,000), generous (220 / 11,000); per-policy results in reports/decision_sensitivity_report.csv and ..._summary.json (Table 7).</w:t>
+        <w:t>Three budgets - scarce (100 crews, 5,000 daily capacity), moderate (160 / 8,000), and generous (220 / 11,000); per-policy results are reported in Table 3.</w:t>
       </w:r>
     </w:p>
     <w:p>
       <w:pPr>
+        <w:keepNext/>
         <w:spacing w:before="240" w:after="120"/>
       </w:pPr>
       <w:r>
@@ -2942,11 +3135,14 @@
           <w:i w:val="0"/>
           <w:sz w:val="24"/>
         </w:rPr>
-        <w:t>Single NOAA station (USW00094728) joined to all boroughs by date; temp_avg_c derived from observed TMAX/TMIN (source TAVG empty); five missing wind-speed days time-interpolated from real neighbours; no synthetic weather (data/metadata/weather_source_report.json). Figure 8 shows the series.</w:t>
+        <w:t>Single NOAA station (USW00094728) joined to all boroughs by date; temp_avg_c derived from observed daily maximum and minimum (source average-temperature field empty); five missing wind-speed days time-interpolated from real neighbours; no synthetic weather. Figure A1 shows the series.</w:t>
       </w:r>
     </w:p>
     <w:p>
       <w:pPr>
+        <w:keepNext/>
+        <w:keepLines/>
+        <w:spacing w:before="120"/>
         <w:jc w:val="center"/>
       </w:pPr>
       <w:r>
@@ -2986,6 +3182,7 @@
     </w:p>
     <w:p>
       <w:pPr>
+        <w:keepLines/>
         <w:jc w:val="center"/>
       </w:pPr>
       <w:r>
@@ -2995,11 +3192,12 @@
           <w:i/>
           <w:sz w:val="20"/>
         </w:rPr>
-        <w:t>Figure 8. Real NOAA daily weather series for the Central Park station over 2022-2024.</w:t>
+        <w:t>Figure A1. Real NOAA daily weather series for the Central Park station, 2022-2024.</w:t>
       </w:r>
     </w:p>
     <w:p>
       <w:pPr>
+        <w:keepNext/>
         <w:spacing w:before="240" w:after="120"/>
       </w:pPr>
       <w:r>
@@ -3023,11 +3221,12 @@
           <w:i w:val="0"/>
           <w:sz w:val="24"/>
         </w:rPr>
-        <w:t>Table G1 is the complete 13-row model comparison (reports/model_comparison.csv; Figure 1). Table G2 reports per-borough robustness (reports/borough_performance.csv; Figure 4) and Table G3 per-complaint-group robustness (reports/complaint_group_performance.csv; Figure 5), each comparing internal-historical vs calendar-augmented for the random forest. Figure 10 shows internal vs calendar-augmented per model; Figure 9 shows a baseline-budget policy comparison with the oracle.</w:t>
+        <w:t>Table A3 is the complete 13-row model comparison (Figure A2). Table A4 reports per-borough robustness (Figure A3) and Table A5 per-complaint-group robustness (Figure A4), each comparing internal history with calendar for the random forest. Figure A6 shows internal history versus calendar per model; Figure A5 shows a baseline-budget policy comparison with the oracle.</w:t>
       </w:r>
     </w:p>
     <w:p>
       <w:pPr>
+        <w:keepNext/>
         <w:spacing w:before="160"/>
       </w:pPr>
       <w:r>
@@ -3037,7 +3236,7 @@
           <w:i w:val="0"/>
           <w:sz w:val="22"/>
         </w:rPr>
-        <w:t>Table G1. Full model comparison (held-out test).</w:t>
+        <w:t>Table A3. Full model comparison (held-out test).</w:t>
       </w:r>
     </w:p>
     <w:tbl>
@@ -3056,6 +3255,10 @@
         <w:gridCol w:w="1560"/>
       </w:tblGrid>
       <w:tr>
+        <w:trPr>
+          <w:tblHeader w:val="true"/>
+          <w:cantSplit/>
+        </w:trPr>
         <w:tc>
           <w:tcPr>
             <w:tcW w:type="dxa" w:w="1560"/>
@@ -3154,12 +3357,15 @@
                 <w:i w:val="0"/>
                 <w:sz w:val="18"/>
               </w:rPr>
-              <w:t>Test R2</w:t>
+              <w:t>Test R²</w:t>
             </w:r>
           </w:p>
         </w:tc>
       </w:tr>
       <w:tr>
+        <w:trPr>
+          <w:cantSplit/>
+        </w:trPr>
         <w:tc>
           <w:tcPr>
             <w:tcW w:type="dxa" w:w="1560"/>
@@ -3264,6 +3470,9 @@
         </w:tc>
       </w:tr>
       <w:tr>
+        <w:trPr>
+          <w:cantSplit/>
+        </w:trPr>
         <w:tc>
           <w:tcPr>
             <w:tcW w:type="dxa" w:w="1560"/>
@@ -3368,6 +3577,9 @@
         </w:tc>
       </w:tr>
       <w:tr>
+        <w:trPr>
+          <w:cantSplit/>
+        </w:trPr>
         <w:tc>
           <w:tcPr>
             <w:tcW w:type="dxa" w:w="1560"/>
@@ -3472,6 +3684,9 @@
         </w:tc>
       </w:tr>
       <w:tr>
+        <w:trPr>
+          <w:cantSplit/>
+        </w:trPr>
         <w:tc>
           <w:tcPr>
             <w:tcW w:type="dxa" w:w="1560"/>
@@ -3576,6 +3791,9 @@
         </w:tc>
       </w:tr>
       <w:tr>
+        <w:trPr>
+          <w:cantSplit/>
+        </w:trPr>
         <w:tc>
           <w:tcPr>
             <w:tcW w:type="dxa" w:w="1560"/>
@@ -3680,6 +3898,9 @@
         </w:tc>
       </w:tr>
       <w:tr>
+        <w:trPr>
+          <w:cantSplit/>
+        </w:trPr>
         <w:tc>
           <w:tcPr>
             <w:tcW w:type="dxa" w:w="1560"/>
@@ -3784,6 +4005,9 @@
         </w:tc>
       </w:tr>
       <w:tr>
+        <w:trPr>
+          <w:cantSplit/>
+        </w:trPr>
         <w:tc>
           <w:tcPr>
             <w:tcW w:type="dxa" w:w="1560"/>
@@ -3888,6 +4112,9 @@
         </w:tc>
       </w:tr>
       <w:tr>
+        <w:trPr>
+          <w:cantSplit/>
+        </w:trPr>
         <w:tc>
           <w:tcPr>
             <w:tcW w:type="dxa" w:w="1560"/>
@@ -3992,6 +4219,9 @@
         </w:tc>
       </w:tr>
       <w:tr>
+        <w:trPr>
+          <w:cantSplit/>
+        </w:trPr>
         <w:tc>
           <w:tcPr>
             <w:tcW w:type="dxa" w:w="1560"/>
@@ -4096,6 +4326,9 @@
         </w:tc>
       </w:tr>
       <w:tr>
+        <w:trPr>
+          <w:cantSplit/>
+        </w:trPr>
         <w:tc>
           <w:tcPr>
             <w:tcW w:type="dxa" w:w="1560"/>
@@ -4200,6 +4433,9 @@
         </w:tc>
       </w:tr>
       <w:tr>
+        <w:trPr>
+          <w:cantSplit/>
+        </w:trPr>
         <w:tc>
           <w:tcPr>
             <w:tcW w:type="dxa" w:w="1560"/>
@@ -4304,6 +4540,9 @@
         </w:tc>
       </w:tr>
       <w:tr>
+        <w:trPr>
+          <w:cantSplit/>
+        </w:trPr>
         <w:tc>
           <w:tcPr>
             <w:tcW w:type="dxa" w:w="1560"/>
@@ -4408,6 +4647,9 @@
         </w:tc>
       </w:tr>
       <w:tr>
+        <w:trPr>
+          <w:cantSplit/>
+        </w:trPr>
         <w:tc>
           <w:tcPr>
             <w:tcW w:type="dxa" w:w="1560"/>
@@ -4515,6 +4757,7 @@
     <w:p/>
     <w:p>
       <w:pPr>
+        <w:keepNext/>
         <w:spacing w:before="160"/>
       </w:pPr>
       <w:r>
@@ -4524,7 +4767,7 @@
           <w:i w:val="0"/>
           <w:sz w:val="22"/>
         </w:rPr>
-        <w:t>Table G2. Borough robustness (random forest; internal vs calendar).</w:t>
+        <w:t>Table A4. Borough robustness (random forest; internal history versus calendar).</w:t>
       </w:r>
     </w:p>
     <w:tbl>
@@ -4541,6 +4784,10 @@
         <w:gridCol w:w="2340"/>
       </w:tblGrid>
       <w:tr>
+        <w:trPr>
+          <w:tblHeader w:val="true"/>
+          <w:cantSplit/>
+        </w:trPr>
         <w:tc>
           <w:tcPr>
             <w:tcW w:type="dxa" w:w="2340"/>
@@ -4611,6 +4858,9 @@
         </w:tc>
       </w:tr>
       <w:tr>
+        <w:trPr>
+          <w:cantSplit/>
+        </w:trPr>
         <w:tc>
           <w:tcPr>
             <w:tcW w:type="dxa" w:w="2340"/>
@@ -4681,6 +4931,9 @@
         </w:tc>
       </w:tr>
       <w:tr>
+        <w:trPr>
+          <w:cantSplit/>
+        </w:trPr>
         <w:tc>
           <w:tcPr>
             <w:tcW w:type="dxa" w:w="2340"/>
@@ -4751,6 +5004,9 @@
         </w:tc>
       </w:tr>
       <w:tr>
+        <w:trPr>
+          <w:cantSplit/>
+        </w:trPr>
         <w:tc>
           <w:tcPr>
             <w:tcW w:type="dxa" w:w="2340"/>
@@ -4821,6 +5077,9 @@
         </w:tc>
       </w:tr>
       <w:tr>
+        <w:trPr>
+          <w:cantSplit/>
+        </w:trPr>
         <w:tc>
           <w:tcPr>
             <w:tcW w:type="dxa" w:w="2340"/>
@@ -4891,6 +5150,9 @@
         </w:tc>
       </w:tr>
       <w:tr>
+        <w:trPr>
+          <w:cantSplit/>
+        </w:trPr>
         <w:tc>
           <w:tcPr>
             <w:tcW w:type="dxa" w:w="2340"/>
@@ -4964,6 +5226,7 @@
     <w:p/>
     <w:p>
       <w:pPr>
+        <w:keepNext/>
         <w:spacing w:before="160"/>
       </w:pPr>
       <w:r>
@@ -4973,7 +5236,7 @@
           <w:i w:val="0"/>
           <w:sz w:val="22"/>
         </w:rPr>
-        <w:t>Table G3. Complaint-group robustness (random forest; internal vs calendar).</w:t>
+        <w:t>Table A5. Complaint-group robustness (random forest; internal history versus calendar).</w:t>
       </w:r>
     </w:p>
     <w:tbl>
@@ -4990,6 +5253,10 @@
         <w:gridCol w:w="2340"/>
       </w:tblGrid>
       <w:tr>
+        <w:trPr>
+          <w:tblHeader w:val="true"/>
+          <w:cantSplit/>
+        </w:trPr>
         <w:tc>
           <w:tcPr>
             <w:tcW w:type="dxa" w:w="2340"/>
@@ -5060,6 +5327,9 @@
         </w:tc>
       </w:tr>
       <w:tr>
+        <w:trPr>
+          <w:cantSplit/>
+        </w:trPr>
         <w:tc>
           <w:tcPr>
             <w:tcW w:type="dxa" w:w="2340"/>
@@ -5130,6 +5400,9 @@
         </w:tc>
       </w:tr>
       <w:tr>
+        <w:trPr>
+          <w:cantSplit/>
+        </w:trPr>
         <w:tc>
           <w:tcPr>
             <w:tcW w:type="dxa" w:w="2340"/>
@@ -5200,6 +5473,9 @@
         </w:tc>
       </w:tr>
       <w:tr>
+        <w:trPr>
+          <w:cantSplit/>
+        </w:trPr>
         <w:tc>
           <w:tcPr>
             <w:tcW w:type="dxa" w:w="2340"/>
@@ -5270,6 +5546,9 @@
         </w:tc>
       </w:tr>
       <w:tr>
+        <w:trPr>
+          <w:cantSplit/>
+        </w:trPr>
         <w:tc>
           <w:tcPr>
             <w:tcW w:type="dxa" w:w="2340"/>
@@ -5340,6 +5619,9 @@
         </w:tc>
       </w:tr>
       <w:tr>
+        <w:trPr>
+          <w:cantSplit/>
+        </w:trPr>
         <w:tc>
           <w:tcPr>
             <w:tcW w:type="dxa" w:w="2340"/>
@@ -5410,6 +5692,9 @@
         </w:tc>
       </w:tr>
       <w:tr>
+        <w:trPr>
+          <w:cantSplit/>
+        </w:trPr>
         <w:tc>
           <w:tcPr>
             <w:tcW w:type="dxa" w:w="2340"/>
@@ -5480,6 +5765,9 @@
         </w:tc>
       </w:tr>
       <w:tr>
+        <w:trPr>
+          <w:cantSplit/>
+        </w:trPr>
         <w:tc>
           <w:tcPr>
             <w:tcW w:type="dxa" w:w="2340"/>
@@ -5550,6 +5838,9 @@
         </w:tc>
       </w:tr>
       <w:tr>
+        <w:trPr>
+          <w:cantSplit/>
+        </w:trPr>
         <w:tc>
           <w:tcPr>
             <w:tcW w:type="dxa" w:w="2340"/>
@@ -5623,6 +5914,7 @@
     <w:p/>
     <w:p>
       <w:pPr>
+        <w:keepNext/>
         <w:spacing w:before="160"/>
       </w:pPr>
       <w:r>
@@ -5632,7 +5924,7 @@
           <w:i w:val="0"/>
           <w:sz w:val="22"/>
         </w:rPr>
-        <w:t>Table 8. Limitations and mitigations.</w:t>
+        <w:t>Table A6. Limitations and mitigations.</w:t>
       </w:r>
     </w:p>
     <w:tbl>
@@ -5647,6 +5939,10 @@
         <w:gridCol w:w="4680"/>
       </w:tblGrid>
       <w:tr>
+        <w:trPr>
+          <w:tblHeader w:val="true"/>
+          <w:cantSplit/>
+        </w:trPr>
         <w:tc>
           <w:tcPr>
             <w:tcW w:type="dxa" w:w="4680"/>
@@ -5677,12 +5973,15 @@
                 <w:i w:val="0"/>
                 <w:sz w:val="18"/>
               </w:rPr>
-              <w:t>Mitigation / honest framing</w:t>
+              <w:t>Mitigation / Scope statement</w:t>
             </w:r>
           </w:p>
         </w:tc>
       </w:tr>
       <w:tr>
+        <w:trPr>
+          <w:cantSplit/>
+        </w:trPr>
         <w:tc>
           <w:tcPr>
             <w:tcW w:type="dxa" w:w="4680"/>
@@ -5719,6 +6018,9 @@
         </w:tc>
       </w:tr>
       <w:tr>
+        <w:trPr>
+          <w:cantSplit/>
+        </w:trPr>
         <w:tc>
           <w:tcPr>
             <w:tcW w:type="dxa" w:w="4680"/>
@@ -5755,6 +6057,9 @@
         </w:tc>
       </w:tr>
       <w:tr>
+        <w:trPr>
+          <w:cantSplit/>
+        </w:trPr>
         <w:tc>
           <w:tcPr>
             <w:tcW w:type="dxa" w:w="4680"/>
@@ -5791,6 +6096,9 @@
         </w:tc>
       </w:tr>
       <w:tr>
+        <w:trPr>
+          <w:cantSplit/>
+        </w:trPr>
         <w:tc>
           <w:tcPr>
             <w:tcW w:type="dxa" w:w="4680"/>
@@ -5827,6 +6135,9 @@
         </w:tc>
       </w:tr>
       <w:tr>
+        <w:trPr>
+          <w:cantSplit/>
+        </w:trPr>
         <w:tc>
           <w:tcPr>
             <w:tcW w:type="dxa" w:w="4680"/>
@@ -5857,12 +6168,15 @@
                 <w:i w:val="0"/>
                 <w:sz w:val="18"/>
               </w:rPr>
-              <w:t>Mean of observed TMAX/TMIN; source TAVG empty; documented</w:t>
+              <w:t>Mean of observed daily max/min; source field empty; documented</w:t>
             </w:r>
           </w:p>
         </w:tc>
       </w:tr>
       <w:tr>
+        <w:trPr>
+          <w:cantSplit/>
+        </w:trPr>
         <w:tc>
           <w:tcPr>
             <w:tcW w:type="dxa" w:w="4680"/>
@@ -5899,6 +6213,9 @@
         </w:tc>
       </w:tr>
       <w:tr>
+        <w:trPr>
+          <w:cantSplit/>
+        </w:trPr>
         <w:tc>
           <w:tcPr>
             <w:tcW w:type="dxa" w:w="4680"/>
@@ -5929,12 +6246,15 @@
                 <w:i w:val="0"/>
                 <w:sz w:val="18"/>
               </w:rPr>
-              <w:t>Labelled stylized; not real dispatch; oracle bound included</w:t>
+              <w:t>Labelled stylized; oracle bound included for context</w:t>
             </w:r>
           </w:p>
         </w:tc>
       </w:tr>
       <w:tr>
+        <w:trPr>
+          <w:cantSplit/>
+        </w:trPr>
         <w:tc>
           <w:tcPr>
             <w:tcW w:type="dxa" w:w="4680"/>
@@ -5971,6 +6291,9 @@
         </w:tc>
       </w:tr>
       <w:tr>
+        <w:trPr>
+          <w:cantSplit/>
+        </w:trPr>
         <w:tc>
           <w:tcPr>
             <w:tcW w:type="dxa" w:w="4680"/>
@@ -6007,6 +6330,9 @@
         </w:tc>
       </w:tr>
       <w:tr>
+        <w:trPr>
+          <w:cantSplit/>
+        </w:trPr>
         <w:tc>
           <w:tcPr>
             <w:tcW w:type="dxa" w:w="4680"/>
@@ -6043,6 +6369,9 @@
         </w:tc>
       </w:tr>
       <w:tr>
+        <w:trPr>
+          <w:cantSplit/>
+        </w:trPr>
         <w:tc>
           <w:tcPr>
             <w:tcW w:type="dxa" w:w="4680"/>
@@ -6082,6 +6411,7 @@
     <w:p/>
     <w:p>
       <w:pPr>
+        <w:keepNext/>
         <w:spacing w:before="240" w:after="120"/>
       </w:pPr>
       <w:r>
@@ -6091,7 +6421,7 @@
           <w:i w:val="0"/>
           <w:sz w:val="24"/>
         </w:rPr>
-        <w:t>H. Reproducibility commands</w:t>
+        <w:t>H. Reproducibility</w:t>
       </w:r>
     </w:p>
     <w:p>
@@ -6105,11 +6435,12 @@
           <w:i w:val="0"/>
           <w:sz w:val="24"/>
         </w:rPr>
-        <w:t>See the Reproducibility Statement.</w:t>
+        <w:t>The full analysis is reproducible from the public data sources following the protocol described in Sections 3-7; see the Reproducibility Statement.</w:t>
       </w:r>
     </w:p>
     <w:p>
       <w:pPr>
+        <w:keepNext/>
         <w:spacing w:before="240" w:after="120"/>
       </w:pPr>
       <w:r>
@@ -6124,6 +6455,9 @@
     </w:p>
     <w:p>
       <w:pPr>
+        <w:keepNext/>
+        <w:keepLines/>
+        <w:spacing w:before="120"/>
         <w:jc w:val="center"/>
       </w:pPr>
       <w:r>
@@ -6163,6 +6497,7 @@
     </w:p>
     <w:p>
       <w:pPr>
+        <w:keepLines/>
         <w:jc w:val="center"/>
       </w:pPr>
       <w:r>
@@ -6172,11 +6507,14 @@
           <w:i/>
           <w:sz w:val="20"/>
         </w:rPr>
-        <w:t>Figure 1. Held-out test MAE for the naive baseline and every model x feature-set combination across the four feature sets.</w:t>
+        <w:t>Figure A2. Held-out test MAE for the naive baseline and every model and feature-set combination.</w:t>
       </w:r>
     </w:p>
     <w:p>
       <w:pPr>
+        <w:keepNext/>
+        <w:keepLines/>
+        <w:spacing w:before="120"/>
         <w:jc w:val="center"/>
       </w:pPr>
       <w:r>
@@ -6216,6 +6554,7 @@
     </w:p>
     <w:p>
       <w:pPr>
+        <w:keepLines/>
         <w:jc w:val="center"/>
       </w:pPr>
       <w:r>
@@ -6225,11 +6564,14 @@
           <w:i/>
           <w:sz w:val="20"/>
         </w:rPr>
-        <w:t>Figure 4. Internal-historical vs calendar-augmented test MAE by borough (random forest).</w:t>
+        <w:t>Figure A3. Internal history versus Calendar test MAE by borough (random forest).</w:t>
       </w:r>
     </w:p>
     <w:p>
       <w:pPr>
+        <w:keepNext/>
+        <w:keepLines/>
+        <w:spacing w:before="120"/>
         <w:jc w:val="center"/>
       </w:pPr>
       <w:r>
@@ -6269,6 +6611,7 @@
     </w:p>
     <w:p>
       <w:pPr>
+        <w:keepLines/>
         <w:jc w:val="center"/>
       </w:pPr>
       <w:r>
@@ -6278,11 +6621,14 @@
           <w:i/>
           <w:sz w:val="20"/>
         </w:rPr>
-        <w:t>Figure 5. Internal-historical vs calendar-augmented test MAE by complaint group (random forest).</w:t>
+        <w:t>Figure A4. Internal history versus Calendar test MAE by complaint group (random forest).</w:t>
       </w:r>
     </w:p>
     <w:p>
       <w:pPr>
+        <w:keepNext/>
+        <w:keepLines/>
+        <w:spacing w:before="120"/>
         <w:jc w:val="center"/>
       </w:pPr>
       <w:r>
@@ -6322,6 +6668,7 @@
     </w:p>
     <w:p>
       <w:pPr>
+        <w:keepLines/>
         <w:jc w:val="center"/>
       </w:pPr>
       <w:r>
@@ -6331,11 +6678,14 @@
           <w:i/>
           <w:sz w:val="20"/>
         </w:rPr>
-        <w:t>Figure 9. Total weighted unmet demand by policy at the baseline crew budget, with the oracle benchmark.</w:t>
+        <w:t>Figure A5. Total weighted unmet demand by policy at the baseline crew budget, with the oracle benchmark.</w:t>
       </w:r>
     </w:p>
     <w:p>
       <w:pPr>
+        <w:keepNext/>
+        <w:keepLines/>
+        <w:spacing w:before="120"/>
         <w:jc w:val="center"/>
       </w:pPr>
       <w:r>
@@ -6375,6 +6725,7 @@
     </w:p>
     <w:p>
       <w:pPr>
+        <w:keepLines/>
         <w:jc w:val="center"/>
       </w:pPr>
       <w:r>
@@ -6384,7 +6735,7 @@
           <w:i/>
           <w:sz w:val="20"/>
         </w:rPr>
-        <w:t>Figure 10. Internal-historical vs calendar-augmented test MAE per non-naive model.</w:t>
+        <w:t>Figure A6. Internal history versus Calendar test MAE per non-naive model.</w:t>
       </w:r>
     </w:p>
     <w:p>
@@ -6394,6 +6745,7 @@
     </w:p>
     <w:p>
       <w:pPr>
+        <w:keepNext/>
         <w:spacing w:before="240" w:after="120"/>
       </w:pPr>
       <w:r>
@@ -6417,7 +6769,7 @@
           <w:i w:val="0"/>
           <w:sz w:val="24"/>
         </w:rPr>
-        <w:t>City of New York. (2026). 311 Service Requests from 2010 to Present. NYC Open Data, Socrata dataset erm2-nwe9. https://data.cityofnewyork.us/Social-Services/311-Service-Requests-from-2010-to-Present/erm2-nwe9. Accessed 2026-06-03.</w:t>
+        <w:t>City of New York. (2026). 311 Service Requests from 2010 to Present [data set]. NYC Open Data, Socrata dataset erm2-nwe9. Retrieved 2026-06-03 from https://data.cityofnewyork.us/Social-Services/311-Service-Requests-from-2010-to-Present/erm2-nwe9</w:t>
       </w:r>
     </w:p>
     <w:p>
@@ -6431,7 +6783,7 @@
           <w:i w:val="0"/>
           <w:sz w:val="24"/>
         </w:rPr>
-        <w:t>Cui, R., Gallino, S., Moreno, A., &amp; Zhang, D. J. (2018). The Operational Value of Social Media Information. Production and Operations Management, 27(10), 1749-1769. https://doi.org/10.1111/poms.12707.</w:t>
+        <w:t>Cui, R., Gallino, S., Moreno, A., &amp; Zhang, D. J. (2018). The Operational Value of Social Media Information. Production and Operations Management, 27(10), 1749-1769. https://doi.org/10.1111/poms.12707</w:t>
       </w:r>
     </w:p>
     <w:p>
@@ -6445,7 +6797,7 @@
           <w:i w:val="0"/>
           <w:sz w:val="24"/>
         </w:rPr>
-        <w:t>National Oceanic and Atmospheric Administration, National Centers for Environmental Information. (2026). Global Historical Climatology Network Daily (GHCNd). NOAA NCEI Daily Summaries; station USW00094728, NY City Central Park. https://www.ncei.noaa.gov/products/land-based-station/global-historical-climatology-network-daily. Accessed 2026-06-03.</w:t>
+        <w:t>National Oceanic and Atmospheric Administration, National Centers for Environmental Information. (2026). Global Historical Climatology Network Daily (GHCNd) [data set]. NOAA NCEI Daily Summaries; station USW00094728, NY City Central Park. Retrieved 2026-06-03 from https://www.ncei.noaa.gov/products/land-based-station/global-historical-climatology-network-daily</w:t>
       </w:r>
     </w:p>
     <w:p>
@@ -6459,7 +6811,7 @@
           <w:i w:val="0"/>
           <w:sz w:val="24"/>
         </w:rPr>
-        <w:t>Samorani, M., Harris, S. L., Blount, L. G., Lu, H., &amp; Santoro, M. A. (2022). Overbooked and Overlooked: Machine Learning and Racial Bias in Medical Appointment Scheduling. Manufacturing &amp; Service Operations Management, 24(6), 2825-2842. https://doi.org/10.1287/msom.2021.0999.</w:t>
+        <w:t>Samorani, M., Harris, S. L., Blount, L. G., Lu, H., &amp; Santoro, M. A. (2022). Overbooked and Overlooked: Machine Learning and Racial Bias in Medical Appointment Scheduling. Manufacturing &amp; Service Operations Management, 24(6), 2825-2842. https://doi.org/10.1287/msom.2021.0999</w:t>
       </w:r>
     </w:p>
     <w:sectPr>

</xml_diff>

<commit_message>
Final polish pass on Word submission document
- Remove the title-page scope/disclaimer line (covered in Abstract,
  Limitations, and Ethics)
- Reword Abstract closing sentence to a reproducible-evaluation framing
- Reword Introduction contribution (iii) to neutral academic phrasing
- Keep clean bracketed author/affiliation/email placeholders

No empirical numbers, results, or claims changed.

https://claude.ai/code/session_01TvC5bYfe44i7oUiT2E8utv
</commit_message>
<xml_diff>
--- a/public-signal-service-forecasting/paper/output/public_signal_service_forecasting_final_submission.docx
+++ b/public-signal-service-forecasting/paper/output/public_signal_service_forecasting_final_submission.docx
@@ -60,20 +60,6 @@
     </w:p>
     <w:p>
       <w:pPr>
-        <w:jc w:val="center"/>
-      </w:pPr>
-      <w:r>
-        <w:rPr>
-          <w:rFonts w:ascii="Times New Roman" w:hAnsi="Times New Roman"/>
-          <w:b w:val="0"/>
-          <w:i/>
-          <w:sz w:val="20"/>
-        </w:rPr>
-        <w:t>This study is predictive and correlational. It makes no causal, production-deployment, or real-dispatch claims.</w:t>
-      </w:r>
-    </w:p>
-    <w:p>
-      <w:pPr>
         <w:keepNext/>
         <w:spacing w:before="240" w:after="120"/>
       </w:pPr>
@@ -98,7 +84,7 @@
           <w:i w:val="0"/>
           <w:sz w:val="24"/>
         </w:rPr>
-        <w:t>Day-ahead forecasts of municipal service-request volume are a natural input to staffing and dispatch planning, yet a reduction in average forecast error does not automatically translate into better operational decisions. We ask, on real data, two questions: do public external signals improve next-day forecasts of NYC 311 service-request volume, and does any improvement carry through to a stylized staffing-allocation simulation? Using real NYC 311 Service Requests for 2022-2024 (9,851,452 raw records aggregated to 43,240 date × borough × complaint-group observations) and real NOAA Central Park daily weather, we compare four feature sets - internal history, calendar, weather, and calendar + weather - across four model families under a strictly chronological protocol with five-fold rolling-origin validation. Calendar features deliver the largest accuracy gain; real weather adds a smaller but consistent further gain. The best model, a random forest on the calendar + weather feature set, attains a held-out test mean absolute error (MAE) of 55.325 versus 71.848 for a naive seasonal baseline, a 23.0% reduction. A stylized proportional staffing simulation shows the augmented policy reduces weighted unmet demand at every crew budget tested and closes 26.381% of the gap to an oracle at the baseline budget, but the magnitude of the decision benefit is budget-dependent. The central finding is that the forecast gains are real and robust, while the decision gains are smaller and conditional on capacity. This work provides a reproducible baseline; no synthetic data or synthetic weather is used.</w:t>
+        <w:t>Day-ahead forecasts of municipal service-request volume are a natural input to staffing and dispatch planning, yet a reduction in average forecast error does not automatically translate into better operational decisions. We ask, on real data, two questions: do public external signals improve next-day forecasts of NYC 311 service-request volume, and does any improvement carry through to a stylized staffing-allocation simulation? Using real NYC 311 Service Requests for 2022-2024 (9,851,452 raw records aggregated to 43,240 date × borough × complaint-group observations) and real NOAA Central Park daily weather, we compare four feature sets - internal history, calendar, weather, and calendar + weather - across four model families under a strictly chronological protocol with five-fold rolling-origin validation. Calendar features deliver the largest accuracy gain; real weather adds a smaller but consistent further gain. The best model, a random forest on the calendar + weather feature set, attains a held-out test mean absolute error (MAE) of 55.325 versus 71.848 for a naive seasonal baseline, a 23.0% reduction. A stylized proportional staffing simulation shows the augmented policy reduces weighted unmet demand at every crew budget tested and closes 26.381% of the gap to an oracle at the baseline budget, but the magnitude of the decision benefit is budget-dependent. The central finding is that the forecast gains are real and robust, while the decision gains are smaller and conditional on capacity. This study provides a reproducible evaluation of public-signal augmentation for municipal service-demand forecasting; no synthetic data or synthetic weather is used.</w:t>
       </w:r>
     </w:p>
     <w:p>
@@ -155,7 +141,7 @@
           <w:i w:val="0"/>
           <w:sz w:val="24"/>
         </w:rPr>
-        <w:t>We make three contributions. (i) A reproducible, real-data baseline on NYC 311 augmented with real NOAA weather, with a leakage-controlled chronological protocol. (ii) A controlled four-way feature-set comparison isolating the marginal value of calendar features and of real weather. (iii) A transparent forecast-to-decision simulation that measures whether forecast gains transfer to a stylized allocation, with the result reported as it is: directionally positive but budget-dependent. The study is predictive and correlational; Section 8 states the scope of the analysis and the natural directions for extending it.</w:t>
+        <w:t>We make three contributions. (i) A reproducible, real-data baseline on NYC 311 augmented with real NOAA weather, with a leakage-controlled chronological protocol. (ii) A controlled four-way feature-set comparison isolating the marginal value of calendar features and of real weather. (iii) A transparent forecast-to-decision simulation that measures whether forecast gains transfer to a stylized allocation, showing directionally positive but budget-dependent decision benefits. The study is predictive and correlational; Section 8 states the scope of the analysis and the natural directions for extending it.</w:t>
       </w:r>
     </w:p>
     <w:p>

</xml_diff>

<commit_message>
Insert real author metadata and final claim-safety polish
- Fill the title block and document metadata with the author's details
  (clears the last submission blocker; no placeholders remain)
- Scope the abstract's central finding to 'calendar-augmentation gains'
  (the segment/fold robustness is internal-history vs calendar)
- Note the oracle bound holds 'within this stylized simulation'

No empirical value, result, table, figure, or citation changed.

https://claude.ai/code/session_01TvC5bYfe44i7oUiT2E8utv
</commit_message>
<xml_diff>
--- a/public-signal-service-forecasting/paper/output/public_signal_service_forecasting_final_submission.docx
+++ b/public-signal-service-forecasting/paper/output/public_signal_service_forecasting_final_submission.docx
@@ -30,7 +30,7 @@
           <w:i w:val="0"/>
           <w:sz w:val="24"/>
         </w:rPr>
-        <w:t>[Author Name]</w:t>
+        <w:t>Nassar Naif Alsharif</w:t>
       </w:r>
     </w:p>
     <w:p>
@@ -45,7 +45,7 @@
           <w:i/>
           <w:sz w:val="22"/>
         </w:rPr>
-        <w:t>[Affiliation]</w:t>
+        <w:t>Independent researcher</w:t>
       </w:r>
     </w:p>
     <w:p>
@@ -60,7 +60,7 @@
           <w:i w:val="0"/>
           <w:sz w:val="22"/>
         </w:rPr>
-        <w:t>[Email]</w:t>
+        <w:t>NassarAlsharif0@gmail.com</w:t>
       </w:r>
     </w:p>
     <w:p>
@@ -89,7 +89,7 @@
           <w:i w:val="0"/>
           <w:sz w:val="24"/>
         </w:rPr>
-        <w:t>Day-ahead forecasts of municipal service-request volume are a natural input to staffing and dispatch planning, yet a reduction in average forecast error does not automatically translate into better operational decisions. We ask, on real data, two questions: do public external signals improve next-day forecasts of NYC 311 service-request volume, and does any improvement carry through to a stylized staffing-allocation simulation? Using real NYC 311 Service Requests for 2022-2024 (9,851,452 raw records aggregated to 43,240 date × borough × complaint-group observations) and real NOAA Central Park daily weather, we compare four feature sets—internal history, calendar, weather, and calendar + weather—across four model families under a strictly chronological protocol with five-fold rolling-origin validation. Calendar features deliver the largest accuracy gain across models; adding real weather further improves the selected random-forest model. The best model, a random forest on the calendar + weather feature set, attains a held-out test mean absolute error (MAE) of 55.325 versus 71.848 for a naive seasonal baseline, a 23.0% reduction. A stylized proportional staffing simulation shows the augmented policy reduces weighted unmet demand at every crew budget tested and closes 26.381% of the gap to an oracle at the baseline budget, but the magnitude of the decision benefit is budget-dependent. The central finding is that the forecast gains are consistent across the evaluated splits, folds, boroughs, and complaint groups, while the decision gains are smaller and conditional on capacity. This study provides a reproducible evaluation of public-signal augmentation for municipal service-demand forecasting; no synthetic data or synthetic weather is used.</w:t>
+        <w:t>Day-ahead forecasts of municipal service-request volume are a natural input to staffing and dispatch planning, yet a reduction in average forecast error does not automatically translate into better operational decisions. We ask, on real data, two questions: do public external signals improve next-day forecasts of NYC 311 service-request volume, and does any improvement carry through to a stylized staffing-allocation simulation? Using real NYC 311 Service Requests for 2022-2024 (9,851,452 raw records aggregated to 43,240 date × borough × complaint-group observations) and real NOAA Central Park daily weather, we compare four feature sets—internal history, calendar, weather, and calendar + weather—across four model families under a strictly chronological protocol with five-fold rolling-origin validation. Calendar features deliver the largest accuracy gain across models; adding real weather further improves the selected random-forest model. The best model, a random forest on the calendar + weather feature set, attains a held-out test mean absolute error (MAE) of 55.325 versus 71.848 for a naive seasonal baseline, a 23.0% reduction. A stylized proportional staffing simulation shows the augmented policy reduces weighted unmet demand at every crew budget tested and closes 26.381% of the gap to an oracle at the baseline budget, but the magnitude of the decision benefit is budget-dependent. The central finding is that the calendar-augmentation gains are consistent across the evaluated splits, folds, boroughs, and complaint groups, while the decision gains are smaller and conditional on capacity. This study provides a reproducible evaluation of public-signal augmentation for municipal service-demand forecasting; no synthetic data or synthetic weather is used.</w:t>
       </w:r>
     </w:p>
     <w:p>
@@ -3199,7 +3199,7 @@
           <w:i w:val="0"/>
           <w:sz w:val="24"/>
         </w:rPr>
-        <w:t>Each day, a fixed crew budget is allocated across the 40 (borough × complaint-group) cells in proportion to each cell's forecast, rounded by a largest-remainder rule with a minimum of zero crews per cell. Each crew serves 50 requests per day, so a cell's allocated capacity is 50 times its crew count. Unmet demand in a cell is max(0, actual next-day requests − allocated capacity). Weighted unmet demand multiplies each cell's unmet demand by a complaint-group weight—Public Safety 2.0, Water 1.5, Traffic 1.5, and 1.0 for Noise, Sanitation, Street Condition, Housing, and Other—and is summed over cells and test days. The baseline-budget configuration uses 135 crews over 163 test days. The oracle allocates using the observed (realized) next-day request volume and provides an upper bound on achievable performance; it is not a forecast. The simulation uses no observed dispatch decisions.</w:t>
+        <w:t>Each day, a fixed crew budget is allocated across the 40 (borough × complaint-group) cells in proportion to each cell's forecast, rounded by a largest-remainder rule with a minimum of zero crews per cell. Each crew serves 50 requests per day, so a cell's allocated capacity is 50 times its crew count. Unmet demand in a cell is max(0, actual next-day requests − allocated capacity). Weighted unmet demand multiplies each cell's unmet demand by a complaint-group weight—Public Safety 2.0, Water 1.5, Traffic 1.5, and 1.0 for Noise, Sanitation, Street Condition, Housing, and Other—and is summed over cells and test days. The baseline-budget configuration uses 135 crews over 163 test days. The oracle allocates using the observed (realized) next-day request volume and provides an upper bound on achievable performance within this stylized simulation; it is not a forecast. The simulation uses no observed dispatch decisions.</w:t>
       </w:r>
     </w:p>
     <w:p>

</xml_diff>

<commit_message>
Complete submission polish: related work, code link, readable figures
- Add five verified related-work citations (Elmachtoub & Grigas 2022;
  Bertsimas & Kallus 2020; Steinker, Hoberg & Thonemann 2017; Green,
  Kolesar & Whitt 2007; Kontokosta & Hong 2021) with two new Related Work
  paragraphs; reference list now nine entries, all cited and clickable
- Add a Code and Materials Availability statement with a repository link
- Regenerate Figures 4, A1, and A2 for readability (legend outside the
  plot; larger labelled weather panels; horizontal labelled model-comparison
  bars). Values are unchanged — replotted from the committed report data
- Soften remaining 'consistent' wording ('observed consistently'; scope to
  calendar-augmentation gains) and 'every crew budget' -> 'all three tested
  crew budgets'
- Make inline and reference URLs/DOIs clickable in the PDF

No empirical value, result, table value, or figure datum changed.

https://claude.ai/code/session_01TvC5bYfe44i7oUiT2E8utv
</commit_message>
<xml_diff>
--- a/public-signal-service-forecasting/paper/output/public_signal_service_forecasting_final_submission.docx
+++ b/public-signal-service-forecasting/paper/output/public_signal_service_forecasting_final_submission.docx
@@ -89,7 +89,7 @@
           <w:i w:val="0"/>
           <w:sz w:val="24"/>
         </w:rPr>
-        <w:t>Day-ahead forecasts of municipal service-request volume are a natural input to staffing and dispatch planning, yet a reduction in average forecast error does not automatically translate into better operational decisions. We ask, on real data, two questions: do public external signals improve next-day forecasts of NYC 311 service-request volume, and does any improvement carry through to a stylized staffing-allocation simulation? Using real NYC 311 Service Requests for 2022-2024 (9,851,452 raw records aggregated to 43,240 date × borough × complaint-group observations) and real NOAA Central Park daily weather, we compare four feature sets—internal history, calendar, weather, and calendar + weather—across four model families under a strictly chronological protocol with five-fold rolling-origin validation. Calendar features deliver the largest accuracy gain across models; adding real weather further improves the selected random-forest model. The best model, a random forest on the calendar + weather feature set, attains a held-out test mean absolute error (MAE) of 55.325 versus 71.848 for a naive seasonal baseline, a 23.0% reduction. A stylized proportional staffing simulation shows the augmented policy reduces weighted unmet demand at every crew budget tested and closes 26.381% of the gap to an oracle at the baseline budget, but the magnitude of the decision benefit is budget-dependent. The central finding is that the calendar-augmentation gains are consistent across the evaluated splits, folds, boroughs, and complaint groups, while the decision gains are smaller and conditional on capacity. This study provides a reproducible evaluation of public-signal augmentation for municipal service-demand forecasting; no synthetic data or synthetic weather is used.</w:t>
+        <w:t>Day-ahead forecasts of municipal service-request volume are a natural input to staffing and dispatch planning, yet a reduction in average forecast error does not automatically translate into better operational decisions. We ask, on real data, two questions: do public external signals improve next-day forecasts of NYC 311 service-request volume, and does any improvement carry through to a stylized staffing-allocation simulation? Using real NYC 311 Service Requests for 2022-2024 (9,851,452 raw records aggregated to 43,240 date × borough × complaint-group observations) and real NOAA Central Park daily weather, we compare four feature sets—internal history, calendar, weather, and calendar + weather—across four model families under a strictly chronological protocol with five-fold rolling-origin validation. Calendar features deliver the largest accuracy gain across models; adding real weather further improves the selected random-forest model. The best model, a random forest on the calendar + weather feature set, attains a held-out test mean absolute error (MAE) of 55.325 versus 71.848 for a naive seasonal baseline, a 23.0% reduction. A stylized proportional staffing simulation shows the augmented policy reduces weighted unmet demand at all three tested crew budgets and closes 26.381% of the gap to an oracle at the baseline budget, but the magnitude of the decision benefit is budget-dependent. The central finding is that the calendar-augmentation gains are observed consistently across the evaluated splits, folds, boroughs, and complaint groups, while the decision gains are smaller and conditional on capacity. This study provides a reproducible evaluation of public-signal augmentation for municipal service-demand forecasting; no synthetic data or synthetic weather is used.</w:t>
       </w:r>
     </w:p>
     <w:p>
@@ -189,7 +189,35 @@
           <w:i w:val="0"/>
           <w:sz w:val="24"/>
         </w:rPr>
-        <w:t>Prediction-driven prioritization in service and scheduling settings has been studied from an equity and efficiency angle (Samorani et al., 2022). We make no equity or causal claim; we cite this line only to situate the general point that the objective placed on top of a predictive model, not the model alone, shapes outcomes—which motivates our separate evaluation of the decision layer.</w:t>
+        <w:t>A second line argues that predictive accuracy and decision quality are distinct objectives. Elmachtoub and Grigas (2022) develop a “predict, then optimize” framework in which models are trained with respect to the downstream optimization objective rather than prediction error alone, and Bertsimas and Kallus (2020) show how predictive models can be turned into prescriptions for decision problems. Our forecast-to-decision simulation is motivated by the same distinction, although we keep the allocation deliberately stylized and evaluate the decision objective rather than re-training the forecaster for it.</w:t>
+      </w:r>
+    </w:p>
+    <w:p>
+      <w:pPr>
+        <w:jc w:val="both"/>
+      </w:pPr>
+      <w:r>
+        <w:rPr>
+          <w:rFonts w:ascii="Times New Roman" w:hAnsi="Times New Roman"/>
+          <w:b w:val="0"/>
+          <w:i w:val="0"/>
+          <w:sz w:val="24"/>
+        </w:rPr>
+        <w:t>Within operations, public weather data has been shown to improve demand forecasts: Steinker, Hoberg, and Thonemann (2017) quantify the value of weather information for e-commerce order forecasting, which parallels our use of NOAA weather as a public signal. Planning capacity against time-varying demand is a long-standing service-operations problem; Green, Kolesar, and Whitt (2007) study staffing requirements when demand varies over time, motivating our crew-budget sensitivity analysis.</w:t>
+      </w:r>
+    </w:p>
+    <w:p>
+      <w:pPr>
+        <w:jc w:val="both"/>
+      </w:pPr>
+      <w:r>
+        <w:rPr>
+          <w:rFonts w:ascii="Times New Roman" w:hAnsi="Times New Roman"/>
+          <w:b w:val="0"/>
+          <w:i w:val="0"/>
+          <w:sz w:val="24"/>
+        </w:rPr>
+        <w:t>Prediction-driven prioritization in service and scheduling settings has been studied from an equity and efficiency angle (Samorani et al., 2022). We make no equity or causal claim; we cite this line only to situate the general point that the objective placed on top of a predictive model, not the model alone, shapes outcomes—which motivates our separate evaluation of the decision layer. Relatedly, our use of 311 data inherits a documented reporting bias: Kontokosta and Hong (2021) show that socio-spatial disparities in 311 complaint behaviour can make data-driven decisions unfair, which is why we frame the forecasting target as reported request volume rather than underlying need.</w:t>
       </w:r>
     </w:p>
     <w:p>
@@ -2126,7 +2154,7 @@
           <w:i w:val="0"/>
           <w:sz w:val="24"/>
         </w:rPr>
-        <w:t>Five-fold expanding-window rolling-origin validation (Figure 4; full table in Appendix C) shows calendar augmentation lowering MAE in every fold for every model: mean improvement 15.13% for the random forest, 9.94% for gradient boosting, and 0.94% for Ridge, each in all 5 of 5 folds. The calendar + weather random forest has the lowest mean fold MAE (47.497). Segmented analysis (random forest, internal history versus calendar; Appendix G) shows the improvement holds for all five boroughs (about 8.8% to 18.8%) and all eight complaint groups (about 8.9% to 25.8%); absolute error concentrates in the highest-volume segments (Noise, Housing; the Bronx). The forecast improvement is therefore consistent across folds and segments, and is not driven by any single split.</w:t>
+        <w:t>Five-fold expanding-window rolling-origin validation (Figure 4; full table in Appendix C) shows calendar augmentation lowering MAE in every fold for every model: mean improvement 15.13% for the random forest, 9.94% for gradient boosting, and 0.94% for Ridge, each in all 5 of 5 folds. The calendar + weather random forest has the lowest mean fold MAE (47.497). Segmented analysis (random forest, internal history versus calendar; Appendix G) shows the improvement holds for all five boroughs (about 8.8% to 18.8%) and all eight complaint groups (about 8.9% to 25.8%); absolute error concentrates in the highest-volume segments (Noise, Housing; the Bronx). The calendar improvement is therefore observed consistently across folds and segments, and is not driven by any single split.</w:t>
       </w:r>
     </w:p>
     <w:p>
@@ -2139,7 +2167,7 @@
       <w:r>
         <w:drawing>
           <wp:inline xmlns:a="http://schemas.openxmlformats.org/drawingml/2006/main" xmlns:pic="http://schemas.openxmlformats.org/drawingml/2006/picture">
-            <wp:extent cx="5486400" cy="2992582"/>
+            <wp:extent cx="5486400" cy="3060915"/>
             <wp:docPr id="4" name="Picture 4"/>
             <wp:cNvGraphicFramePr>
               <a:graphicFrameLocks noChangeAspect="1"/>
@@ -2160,7 +2188,7 @@
                   <pic:spPr>
                     <a:xfrm>
                       <a:off x="0" y="0"/>
-                      <a:ext cx="5486400" cy="2992582"/>
+                      <a:ext cx="5486400" cy="3060915"/>
                     </a:xfrm>
                     <a:prstGeom prst="rect"/>
                   </pic:spPr>
@@ -2255,7 +2283,7 @@
           <w:i w:val="0"/>
           <w:sz w:val="24"/>
         </w:rPr>
-        <w:t>On real NYC 311 data augmented with real NOAA weather, public-signal augmentation improves next-day service-demand forecasts—calendar features most, across rolling folds, boroughs, and complaint groups, with real weather adding a further gain for the selected random-forest model. The improvement transfers in direction to a stylized staffing allocation but with attenuated, budget-dependent magnitude. The forecast gains are consistent across the evaluated splits, folds, and segments; the decision gains are smaller and conditional on capacity. This provides a reproducible evaluation framework for forecast-to-decision analysis in municipal service operations.</w:t>
+        <w:t>On real NYC 311 data augmented with real NOAA weather, public-signal augmentation improves next-day service-demand forecasts—calendar features most, across rolling folds, boroughs, and complaint groups, with real weather adding a further gain for the selected random-forest model. The improvement transfers in direction to a stylized staffing allocation but with attenuated, budget-dependent magnitude. The calendar-augmentation gains are observed consistently across the evaluated splits, folds, and segments; the decision gains are smaller and conditional on capacity. This provides a reproducible evaluation framework for forecast-to-decision analysis in municipal service operations.</w:t>
       </w:r>
     </w:p>
     <w:p>
@@ -2314,6 +2342,35 @@
           <w:sz w:val="24"/>
         </w:rPr>
         <w:t>NYC 311 Service Requests are publicly available through NYC Open Data (Socrata dataset erm2-nwe9), and NOAA NCEI Daily Summaries (GHCN-Daily) for station USW00094728 are publicly available through NOAA NCEI; full identifiers and retrieval dates are given in the references. The study window is 2022-2024. The aggregated daily counts and the derived weather series used in the analysis are obtained from these public sources following the procedure described above, and the full modelling dataset is reproducible from them. No synthetic data are used.</w:t>
+      </w:r>
+    </w:p>
+    <w:p>
+      <w:pPr>
+        <w:keepNext/>
+        <w:spacing w:before="240" w:after="120"/>
+      </w:pPr>
+      <w:r>
+        <w:rPr>
+          <w:rFonts w:ascii="Times New Roman" w:hAnsi="Times New Roman"/>
+          <w:b/>
+          <w:i w:val="0"/>
+          <w:sz w:val="28"/>
+        </w:rPr>
+        <w:t>Code and Materials Availability</w:t>
+      </w:r>
+    </w:p>
+    <w:p>
+      <w:pPr>
+        <w:jc w:val="both"/>
+      </w:pPr>
+      <w:r>
+        <w:rPr>
+          <w:rFonts w:ascii="Times New Roman" w:hAnsi="Times New Roman"/>
+          <w:b w:val="0"/>
+          <w:i w:val="0"/>
+          <w:sz w:val="24"/>
+        </w:rPr>
+        <w:t>The analysis code, the derived summary outputs, and the figures reproduced here are available in the project repository at https://github.com/Nassar-Coding/Nassar-Coding.github.io (the public-signal-service-forecasting directory).</w:t>
       </w:r>
     </w:p>
     <w:p>
@@ -3270,7 +3327,7 @@
       <w:r>
         <w:drawing>
           <wp:inline xmlns:a="http://schemas.openxmlformats.org/drawingml/2006/main" xmlns:pic="http://schemas.openxmlformats.org/drawingml/2006/picture">
-            <wp:extent cx="5486400" cy="3288030"/>
+            <wp:extent cx="5486400" cy="5303520"/>
             <wp:docPr id="5" name="Picture 5"/>
             <wp:cNvGraphicFramePr>
               <a:graphicFrameLocks noChangeAspect="1"/>
@@ -3291,7 +3348,7 @@
                   <pic:spPr>
                     <a:xfrm>
                       <a:off x="0" y="0"/>
-                      <a:ext cx="5486400" cy="3288030"/>
+                      <a:ext cx="5486400" cy="5303520"/>
                     </a:xfrm>
                     <a:prstGeom prst="rect"/>
                   </pic:spPr>
@@ -6614,7 +6671,7 @@
       <w:r>
         <w:drawing>
           <wp:inline xmlns:a="http://schemas.openxmlformats.org/drawingml/2006/main" xmlns:pic="http://schemas.openxmlformats.org/drawingml/2006/picture">
-            <wp:extent cx="5486400" cy="2286000"/>
+            <wp:extent cx="5486400" cy="4267200"/>
             <wp:docPr id="6" name="Picture 6"/>
             <wp:cNvGraphicFramePr>
               <a:graphicFrameLocks noChangeAspect="1"/>
@@ -6635,7 +6692,7 @@
                   <pic:spPr>
                     <a:xfrm>
                       <a:off x="0" y="0"/>
-                      <a:ext cx="5486400" cy="2286000"/>
+                      <a:ext cx="5486400" cy="4267200"/>
                     </a:xfrm>
                     <a:prstGeom prst="rect"/>
                   </pic:spPr>
@@ -6916,6 +6973,21 @@
           <w:i w:val="0"/>
           <w:sz w:val="24"/>
         </w:rPr>
+        <w:t>Bertsimas, D., &amp; Kallus, N. (2020). From Predictive to Prescriptive Analytics. Management Science, 66(3), 1025-1044. https://doi.org/10.1287/mnsc.2018.3253</w:t>
+      </w:r>
+    </w:p>
+    <w:p>
+      <w:pPr>
+        <w:spacing w:after="120"/>
+        <w:ind w:left="720" w:hanging="720"/>
+      </w:pPr>
+      <w:r>
+        <w:rPr>
+          <w:rFonts w:ascii="Times New Roman" w:hAnsi="Times New Roman"/>
+          <w:b w:val="0"/>
+          <w:i w:val="0"/>
+          <w:sz w:val="24"/>
+        </w:rPr>
         <w:t>City of New York. (2026). 311 Service Requests from 2020 to Present [data set]. NYC Open Data, Socrata dataset erm2-nwe9. Retrieved 2026-06-03 from https://data.cityofnewyork.us/Social-Services/311-Service-Requests-from-2020-to-Present/erm2-nwe9</w:t>
       </w:r>
     </w:p>
@@ -6946,6 +7018,51 @@
           <w:i w:val="0"/>
           <w:sz w:val="24"/>
         </w:rPr>
+        <w:t>Elmachtoub, A. N., &amp; Grigas, P. (2022). Smart “Predict, then Optimize”. Management Science, 68(1), 9-26. https://doi.org/10.1287/mnsc.2020.3922</w:t>
+      </w:r>
+    </w:p>
+    <w:p>
+      <w:pPr>
+        <w:spacing w:after="120"/>
+        <w:ind w:left="720" w:hanging="720"/>
+      </w:pPr>
+      <w:r>
+        <w:rPr>
+          <w:rFonts w:ascii="Times New Roman" w:hAnsi="Times New Roman"/>
+          <w:b w:val="0"/>
+          <w:i w:val="0"/>
+          <w:sz w:val="24"/>
+        </w:rPr>
+        <w:t>Green, L. V., Kolesar, P. J., &amp; Whitt, W. (2007). Coping with Time-Varying Demand When Setting Staffing Requirements for a Service System. Production and Operations Management, 16(1), 13-39. https://doi.org/10.1111/j.1937-5956.2007.tb00164.x</w:t>
+      </w:r>
+    </w:p>
+    <w:p>
+      <w:pPr>
+        <w:spacing w:after="120"/>
+        <w:ind w:left="720" w:hanging="720"/>
+      </w:pPr>
+      <w:r>
+        <w:rPr>
+          <w:rFonts w:ascii="Times New Roman" w:hAnsi="Times New Roman"/>
+          <w:b w:val="0"/>
+          <w:i w:val="0"/>
+          <w:sz w:val="24"/>
+        </w:rPr>
+        <w:t>Kontokosta, C. E., &amp; Hong, B. (2021). Bias in smart city governance: How socio-spatial disparities in 311 complaint behavior impact the fairness of data-driven decisions. Sustainable Cities and Society, 64, 102503. https://doi.org/10.1016/j.scs.2020.102503</w:t>
+      </w:r>
+    </w:p>
+    <w:p>
+      <w:pPr>
+        <w:spacing w:after="120"/>
+        <w:ind w:left="720" w:hanging="720"/>
+      </w:pPr>
+      <w:r>
+        <w:rPr>
+          <w:rFonts w:ascii="Times New Roman" w:hAnsi="Times New Roman"/>
+          <w:b w:val="0"/>
+          <w:i w:val="0"/>
+          <w:sz w:val="24"/>
+        </w:rPr>
         <w:t>National Oceanic and Atmospheric Administration, National Centers for Environmental Information. (2026). Global Historical Climatology Network Daily (GHCNd) [data set]. NOAA NCEI Daily Summaries; station USW00094728, NY City Central Park. Retrieved 2026-06-03 from https://www.ncei.noaa.gov/products/land-based-station/global-historical-climatology-network-daily</w:t>
       </w:r>
     </w:p>
@@ -6962,6 +7079,21 @@
           <w:sz w:val="24"/>
         </w:rPr>
         <w:t>Samorani, M., Harris, S. L., Blount, L. G., Lu, H., &amp; Santoro, M. A. (2022). Overbooked and Overlooked: Machine Learning and Racial Bias in Medical Appointment Scheduling. Manufacturing &amp; Service Operations Management, 24(6), 2825-2842. https://doi.org/10.1287/msom.2021.0999</w:t>
+      </w:r>
+    </w:p>
+    <w:p>
+      <w:pPr>
+        <w:spacing w:after="120"/>
+        <w:ind w:left="720" w:hanging="720"/>
+      </w:pPr>
+      <w:r>
+        <w:rPr>
+          <w:rFonts w:ascii="Times New Roman" w:hAnsi="Times New Roman"/>
+          <w:b w:val="0"/>
+          <w:i w:val="0"/>
+          <w:sz w:val="24"/>
+        </w:rPr>
+        <w:t>Steinker, S., Hoberg, K., &amp; Thonemann, U. W. (2017). The Value of Weather Information for E-Commerce Operations. Production and Operations Management, 26(10), 1854-1874. https://doi.org/10.1111/poms.12721</w:t>
       </w:r>
     </w:p>
     <w:sectPr>

</xml_diff>